<commit_message>
doc fase 2 jason venegas
</commit_message>
<xml_diff>
--- a/Fase 2/Evidencias Individuales/Jason_Venegas_2.1_APT122_DiarioReflexionFase2.docx
+++ b/Fase 2/Evidencias Individuales/Jason_Venegas_2.1_APT122_DiarioReflexionFase2.docx
@@ -1,6 +1,6 @@
 
 <file path=word/document.xml><?xml version="1.0" encoding="utf-8"?>
-<w:document xmlns:wpc="http://schemas.microsoft.com/office/word/2010/wordprocessingCanvas" xmlns:cx="http://schemas.microsoft.com/office/drawing/2014/chartex" xmlns:mc="http://schemas.openxmlformats.org/markup-compatibility/2006" xmlns:o="urn:schemas-microsoft-com:office:office" xmlns:r="http://schemas.openxmlformats.org/officeDocument/2006/relationships" xmlns:m="http://schemas.openxmlformats.org/officeDocument/2006/math" xmlns:v="urn:schemas-microsoft-com:vml" xmlns:wp14="http://schemas.microsoft.com/office/word/2010/wordprocessingDrawing" xmlns:wp="http://schemas.openxmlformats.org/drawingml/2006/wordprocessingDrawing" xmlns:w10="urn:schemas-microsoft-com:office:word" xmlns:w="http://schemas.openxmlformats.org/wordprocessingml/2006/main" xmlns:w14="http://schemas.microsoft.com/office/word/2010/wordml" xmlns:w15="http://schemas.microsoft.com/office/word/2012/wordml" xmlns:w16se="http://schemas.microsoft.com/office/word/2015/wordml/symex" xmlns:wpg="http://schemas.microsoft.com/office/word/2010/wordprocessingGroup" xmlns:wpi="http://schemas.microsoft.com/office/word/2010/wordprocessingInk" xmlns:wne="http://schemas.microsoft.com/office/word/2006/wordml" xmlns:wps="http://schemas.microsoft.com/office/word/2010/wordprocessingShape" mc:Ignorable="w14 w15 w16se wp14">
+<w:document xmlns:wpc="http://schemas.microsoft.com/office/word/2010/wordprocessingCanvas" xmlns:cx="http://schemas.microsoft.com/office/drawing/2014/chartex" xmlns:cx1="http://schemas.microsoft.com/office/drawing/2015/9/8/chartex" xmlns:cx2="http://schemas.microsoft.com/office/drawing/2015/10/21/chartex" xmlns:cx3="http://schemas.microsoft.com/office/drawing/2016/5/9/chartex" xmlns:cx4="http://schemas.microsoft.com/office/drawing/2016/5/10/chartex" xmlns:cx5="http://schemas.microsoft.com/office/drawing/2016/5/11/chartex" xmlns:cx6="http://schemas.microsoft.com/office/drawing/2016/5/12/chartex" xmlns:cx7="http://schemas.microsoft.com/office/drawing/2016/5/13/chartex" xmlns:cx8="http://schemas.microsoft.com/office/drawing/2016/5/14/chartex" xmlns:mc="http://schemas.openxmlformats.org/markup-compatibility/2006" xmlns:aink="http://schemas.microsoft.com/office/drawing/2016/ink" xmlns:am3d="http://schemas.microsoft.com/office/drawing/2017/model3d" xmlns:o="urn:schemas-microsoft-com:office:office" xmlns:oel="http://schemas.microsoft.com/office/2019/extlst" xmlns:r="http://schemas.openxmlformats.org/officeDocument/2006/relationships" xmlns:m="http://schemas.openxmlformats.org/officeDocument/2006/math" xmlns:v="urn:schemas-microsoft-com:vml" xmlns:wp14="http://schemas.microsoft.com/office/word/2010/wordprocessingDrawing" xmlns:wp="http://schemas.openxmlformats.org/drawingml/2006/wordprocessingDrawing" xmlns:w10="urn:schemas-microsoft-com:office:word" xmlns:w="http://schemas.openxmlformats.org/wordprocessingml/2006/main" xmlns:w14="http://schemas.microsoft.com/office/word/2010/wordml" xmlns:w15="http://schemas.microsoft.com/office/word/2012/wordml" xmlns:w16cex="http://schemas.microsoft.com/office/word/2018/wordml/cex" xmlns:w16cid="http://schemas.microsoft.com/office/word/2016/wordml/cid" xmlns:w16="http://schemas.microsoft.com/office/word/2018/wordml" xmlns:w16du="http://schemas.microsoft.com/office/word/2023/wordml/word16du" xmlns:w16sdtdh="http://schemas.microsoft.com/office/word/2020/wordml/sdtdatahash" xmlns:w16sdtfl="http://schemas.microsoft.com/office/word/2024/wordml/sdtformatlock" xmlns:w16se="http://schemas.microsoft.com/office/word/2015/wordml/symex" xmlns:wpg="http://schemas.microsoft.com/office/word/2010/wordprocessingGroup" xmlns:wpi="http://schemas.microsoft.com/office/word/2010/wordprocessingInk" xmlns:wne="http://schemas.microsoft.com/office/word/2006/wordml" xmlns:wps="http://schemas.microsoft.com/office/word/2010/wordprocessingShape" mc:Ignorable="w14 w15 w16se w16cid w16 w16cex w16sdtdh w16sdtfl w16du wp14">
   <w:body>
     <w:p/>
     <w:tbl>
@@ -324,23 +324,21 @@
             <w:pPr>
               <w:jc w:val="both"/>
               <w:rPr>
-                <w:rFonts w:eastAsiaTheme="majorEastAsia"/>
-                <w:color w:val="767171" w:themeColor="background2" w:themeShade="80"/>
-                <w:sz w:val="24"/>
-                <w:szCs w:val="24"/>
+                <w:rFonts w:ascii="Calibri" w:hAnsi="Calibri"/>
+                <w:b/>
+                <w:bCs/>
+                <w:color w:val="1F4E79" w:themeColor="accent1" w:themeShade="80"/>
               </w:rPr>
             </w:pPr>
-          </w:p>
-          <w:p>
-            <w:pPr>
-              <w:jc w:val="both"/>
+            <w:r>
               <w:rPr>
                 <w:rFonts w:ascii="Calibri" w:hAnsi="Calibri"/>
                 <w:b/>
                 <w:bCs/>
                 <w:color w:val="1F4E79" w:themeColor="accent1" w:themeShade="80"/>
               </w:rPr>
-            </w:pPr>
+              <w:t>En líneas generales, el ritmo de ejecución se ha mantenido bastante alineado con la planificación original de la Carta Gantt, permitiéndonos concretar los hitos principales en los plazos previstos. No obstante, el camino no ha estado exento de tropiezos: la sincronización y el flujo informativo entre nosotros se vieron rezagados en ciertos momentos clave, sobre todo al tener que rediseñar aspectos estructurales sobre la marcha. A pesar de estos roces de coordinación, la constancia del grupo y la rápida resolución de problemas técnicos nos han impulsado a mantenernos a flote y seguir sumando avances sólidos.</w:t>
+            </w:r>
           </w:p>
           <w:p>
             <w:pPr>
@@ -477,6 +475,15 @@
                 <w:color w:val="1F4E79" w:themeColor="accent1" w:themeShade="80"/>
               </w:rPr>
             </w:pPr>
+            <w:r>
+              <w:rPr>
+                <w:rFonts w:ascii="Calibri" w:hAnsi="Calibri"/>
+                <w:b/>
+                <w:bCs/>
+                <w:color w:val="1F4E79" w:themeColor="accent1" w:themeShade="80"/>
+              </w:rPr>
+              <w:t>Para contrarrestar los baches operativos, optamos por intensificar los espacios de diálogo mediante reuniones de sincronización donde fijamos directrices comunes y acuerdos formales de trabajo. De cara al tramo final, resulta imperativo pulir la fase de previsiones: notificar cualquier cambio técnico con la debida antelación y acotar estrictamente las funciones de cada uno. Con esto buscamos erradicar la duplicidad de esfuerzos y asegurar que la integración de los diferentes módulos del sistema fluya sin contratiempos.</w:t>
+            </w:r>
           </w:p>
           <w:p>
             <w:pPr>
@@ -685,7 +692,6 @@
                 <w:sz w:val="24"/>
                 <w:szCs w:val="24"/>
               </w:rPr>
-              <w:lastRenderedPageBreak/>
               <w:t>¿Cómo evalúas tu</w:t>
             </w:r>
             <w:r>
@@ -742,6 +748,15 @@
                 <w:color w:val="1F4E79" w:themeColor="accent1" w:themeShade="80"/>
               </w:rPr>
             </w:pPr>
+            <w:r>
+              <w:rPr>
+                <w:rFonts w:ascii="Calibri" w:hAnsi="Calibri"/>
+                <w:b/>
+                <w:bCs/>
+                <w:color w:val="1F4E79" w:themeColor="accent1" w:themeShade="80"/>
+              </w:rPr>
+              <w:t>Hago un balance muy favorable de mi aporte personal al proyecto, ya que he sabido responder ante las exigencias técnicas, adaptarme a los cambios imprevistos y respaldar activamente a mis compañeros cuando fue necesario. Como autocrítica y punto a corregir, reconozco que debo ser más proactivo al comunicar modificaciones que puedan repercutir en el trabajo ajeno. Fomentar esa transparencia interna nos garantizará un desarrollo más pulido y facilitará el cumplimiento estricto de las metas de entrega.</w:t>
+            </w:r>
           </w:p>
           <w:p>
             <w:pPr>
@@ -868,6 +883,15 @@
                 <w:color w:val="1F4E79" w:themeColor="accent1" w:themeShade="80"/>
               </w:rPr>
             </w:pPr>
+            <w:r>
+              <w:rPr>
+                <w:rFonts w:ascii="Calibri" w:hAnsi="Calibri"/>
+                <w:b/>
+                <w:bCs/>
+                <w:color w:val="1F4E79" w:themeColor="accent1" w:themeShade="80"/>
+              </w:rPr>
+              <w:t>La mayor incertidumbre que enfrentamos gira en torno al empaquetado y la estructura formal de la documentación solicitada para la presentación definitiva. Nos sería sumamente útil clarificar cuáles son los apartados obligatorios, la jerarquía de contenidos y la pauta de formato exacta que se evaluará. Tener esta directriz clara nos dará la tranquilidad de que el dossier final cumple rigurosamente con los estándares exigidos por la cátedra.</w:t>
+            </w:r>
           </w:p>
           <w:p>
             <w:pPr>
@@ -1032,34 +1056,21 @@
             <w:pPr>
               <w:jc w:val="both"/>
               <w:rPr>
-                <w:rFonts w:eastAsiaTheme="majorEastAsia"/>
-                <w:color w:val="767171" w:themeColor="background2" w:themeShade="80"/>
-                <w:sz w:val="24"/>
-                <w:szCs w:val="24"/>
+                <w:rFonts w:ascii="Calibri" w:hAnsi="Calibri"/>
+                <w:b/>
+                <w:bCs/>
+                <w:color w:val="1F4E79" w:themeColor="accent1" w:themeShade="80"/>
               </w:rPr>
             </w:pPr>
-          </w:p>
-          <w:p>
-            <w:pPr>
-              <w:jc w:val="both"/>
-              <w:rPr>
-                <w:rFonts w:eastAsiaTheme="majorEastAsia"/>
-                <w:color w:val="767171" w:themeColor="background2" w:themeShade="80"/>
-                <w:sz w:val="24"/>
-                <w:szCs w:val="24"/>
-              </w:rPr>
-            </w:pPr>
-          </w:p>
-          <w:p>
-            <w:pPr>
-              <w:jc w:val="both"/>
+            <w:r>
               <w:rPr>
                 <w:rFonts w:ascii="Calibri" w:hAnsi="Calibri"/>
                 <w:b/>
                 <w:bCs/>
                 <w:color w:val="1F4E79" w:themeColor="accent1" w:themeShade="80"/>
               </w:rPr>
-            </w:pPr>
+              <w:t>Sí, es imperativo realizar un reajuste en la asignación de tareas evaluando el volumen de trabajo actual y el estado de avance de cada integrante. Dicha reestructuración la formalizaremos en nuestra próxima sesión de equipo para delegar responsabilidades específicas, poniendo especial foco en las fases críticas que se nos vienen encima: las pruebas de integración de microservicios, el control de calidad del software y la redacción del informe definitivo.</w:t>
+            </w:r>
           </w:p>
         </w:tc>
       </w:tr>
@@ -1141,8 +1152,6 @@
               </w:rPr>
               <w:t>. APT  grupal</w:t>
             </w:r>
-            <w:bookmarkStart w:id="0" w:name="_GoBack"/>
-            <w:bookmarkEnd w:id="0"/>
           </w:p>
         </w:tc>
       </w:tr>
@@ -1190,12 +1199,21 @@
             <w:pPr>
               <w:jc w:val="both"/>
               <w:rPr>
-                <w:rFonts w:eastAsiaTheme="majorEastAsia"/>
-                <w:color w:val="767171" w:themeColor="background2" w:themeShade="80"/>
-                <w:sz w:val="24"/>
-                <w:szCs w:val="24"/>
+                <w:rFonts w:ascii="Calibri" w:hAnsi="Calibri"/>
+                <w:b/>
+                <w:bCs/>
+                <w:color w:val="1F4E79" w:themeColor="accent1" w:themeShade="80"/>
               </w:rPr>
             </w:pPr>
+            <w:r>
+              <w:rPr>
+                <w:rFonts w:ascii="Calibri" w:hAnsi="Calibri"/>
+                <w:b/>
+                <w:bCs/>
+                <w:color w:val="1F4E79" w:themeColor="accent1" w:themeShade="80"/>
+              </w:rPr>
+              <w:t>La experiencia colaborativa ha sido altamente positiva; el equipo ha demostrado una gran resiliencia técnica, capacidad de adaptación frente a los cambios y un fuerte compromiso con las metas trazadas, lo que se refleja en la velocidad con la que fuimos construyendo las distintas funcionalidades del sistema.</w:t>
+            </w:r>
           </w:p>
           <w:p>
             <w:pPr>
@@ -1207,17 +1225,15 @@
                 <w:szCs w:val="24"/>
               </w:rPr>
             </w:pPr>
-          </w:p>
-          <w:p>
-            <w:pPr>
-              <w:jc w:val="both"/>
+            <w:r>
               <w:rPr>
-                <w:rFonts w:eastAsiaTheme="majorEastAsia"/>
-                <w:color w:val="767171" w:themeColor="background2" w:themeShade="80"/>
-                <w:sz w:val="24"/>
-                <w:szCs w:val="24"/>
+                <w:rFonts w:ascii="Calibri" w:hAnsi="Calibri"/>
+                <w:b/>
+                <w:bCs/>
+                <w:color w:val="1F4E79" w:themeColor="accent1" w:themeShade="80"/>
               </w:rPr>
-            </w:pPr>
+              <w:t>Sin embargo, el flanco más débil ha sido la sincronización operativa y el canal de información interno. Para la etapa final, debemos priorizar un control de cambios más transparente y una planificación compartida más rigurosa. Esto evitará descoordinaciones y nos permitirá operar con un nivel de eficiencia mucho mayor.</w:t>
+            </w:r>
           </w:p>
           <w:p>
             <w:pPr>
@@ -1272,7 +1288,7 @@
 </file>
 
 <file path=word/endnotes.xml><?xml version="1.0" encoding="utf-8"?>
-<w:endnotes xmlns:wpc="http://schemas.microsoft.com/office/word/2010/wordprocessingCanvas" xmlns:cx="http://schemas.microsoft.com/office/drawing/2014/chartex" xmlns:mc="http://schemas.openxmlformats.org/markup-compatibility/2006" xmlns:o="urn:schemas-microsoft-com:office:office" xmlns:r="http://schemas.openxmlformats.org/officeDocument/2006/relationships" xmlns:m="http://schemas.openxmlformats.org/officeDocument/2006/math" xmlns:v="urn:schemas-microsoft-com:vml" xmlns:wp14="http://schemas.microsoft.com/office/word/2010/wordprocessingDrawing" xmlns:wp="http://schemas.openxmlformats.org/drawingml/2006/wordprocessingDrawing" xmlns:w10="urn:schemas-microsoft-com:office:word" xmlns:w="http://schemas.openxmlformats.org/wordprocessingml/2006/main" xmlns:w14="http://schemas.microsoft.com/office/word/2010/wordml" xmlns:w15="http://schemas.microsoft.com/office/word/2012/wordml" xmlns:w16se="http://schemas.microsoft.com/office/word/2015/wordml/symex" xmlns:wpg="http://schemas.microsoft.com/office/word/2010/wordprocessingGroup" xmlns:wpi="http://schemas.microsoft.com/office/word/2010/wordprocessingInk" xmlns:wne="http://schemas.microsoft.com/office/word/2006/wordml" xmlns:wps="http://schemas.microsoft.com/office/word/2010/wordprocessingShape" mc:Ignorable="w14 w15 w16se wp14">
+<w:endnotes xmlns:wpc="http://schemas.microsoft.com/office/word/2010/wordprocessingCanvas" xmlns:cx="http://schemas.microsoft.com/office/drawing/2014/chartex" xmlns:cx1="http://schemas.microsoft.com/office/drawing/2015/9/8/chartex" xmlns:cx2="http://schemas.microsoft.com/office/drawing/2015/10/21/chartex" xmlns:cx3="http://schemas.microsoft.com/office/drawing/2016/5/9/chartex" xmlns:cx4="http://schemas.microsoft.com/office/drawing/2016/5/10/chartex" xmlns:cx5="http://schemas.microsoft.com/office/drawing/2016/5/11/chartex" xmlns:cx6="http://schemas.microsoft.com/office/drawing/2016/5/12/chartex" xmlns:cx7="http://schemas.microsoft.com/office/drawing/2016/5/13/chartex" xmlns:cx8="http://schemas.microsoft.com/office/drawing/2016/5/14/chartex" xmlns:mc="http://schemas.openxmlformats.org/markup-compatibility/2006" xmlns:aink="http://schemas.microsoft.com/office/drawing/2016/ink" xmlns:am3d="http://schemas.microsoft.com/office/drawing/2017/model3d" xmlns:o="urn:schemas-microsoft-com:office:office" xmlns:oel="http://schemas.microsoft.com/office/2019/extlst" xmlns:r="http://schemas.openxmlformats.org/officeDocument/2006/relationships" xmlns:m="http://schemas.openxmlformats.org/officeDocument/2006/math" xmlns:v="urn:schemas-microsoft-com:vml" xmlns:wp14="http://schemas.microsoft.com/office/word/2010/wordprocessingDrawing" xmlns:wp="http://schemas.openxmlformats.org/drawingml/2006/wordprocessingDrawing" xmlns:w10="urn:schemas-microsoft-com:office:word" xmlns:w="http://schemas.openxmlformats.org/wordprocessingml/2006/main" xmlns:w14="http://schemas.microsoft.com/office/word/2010/wordml" xmlns:w15="http://schemas.microsoft.com/office/word/2012/wordml" xmlns:w16cex="http://schemas.microsoft.com/office/word/2018/wordml/cex" xmlns:w16cid="http://schemas.microsoft.com/office/word/2016/wordml/cid" xmlns:w16="http://schemas.microsoft.com/office/word/2018/wordml" xmlns:w16du="http://schemas.microsoft.com/office/word/2023/wordml/word16du" xmlns:w16sdtdh="http://schemas.microsoft.com/office/word/2020/wordml/sdtdatahash" xmlns:w16sdtfl="http://schemas.microsoft.com/office/word/2024/wordml/sdtformatlock" xmlns:w16se="http://schemas.microsoft.com/office/word/2015/wordml/symex" xmlns:wpg="http://schemas.microsoft.com/office/word/2010/wordprocessingGroup" xmlns:wpi="http://schemas.microsoft.com/office/word/2010/wordprocessingInk" xmlns:wne="http://schemas.microsoft.com/office/word/2006/wordml" xmlns:wps="http://schemas.microsoft.com/office/word/2010/wordprocessingShape" mc:Ignorable="w14 w15 w16se w16cid w16 w16cex w16sdtdh w16sdtfl w16du wp14">
   <w:endnote w:type="separator" w:id="-1">
     <w:p>
       <w:pPr>
@@ -1297,7 +1313,7 @@
 </file>
 
 <file path=word/footer1.xml><?xml version="1.0" encoding="utf-8"?>
-<w:ftr xmlns:wpc="http://schemas.microsoft.com/office/word/2010/wordprocessingCanvas" xmlns:cx="http://schemas.microsoft.com/office/drawing/2014/chartex" xmlns:mc="http://schemas.openxmlformats.org/markup-compatibility/2006" xmlns:o="urn:schemas-microsoft-com:office:office" xmlns:r="http://schemas.openxmlformats.org/officeDocument/2006/relationships" xmlns:m="http://schemas.openxmlformats.org/officeDocument/2006/math" xmlns:v="urn:schemas-microsoft-com:vml" xmlns:wp14="http://schemas.microsoft.com/office/word/2010/wordprocessingDrawing" xmlns:wp="http://schemas.openxmlformats.org/drawingml/2006/wordprocessingDrawing" xmlns:w10="urn:schemas-microsoft-com:office:word" xmlns:w="http://schemas.openxmlformats.org/wordprocessingml/2006/main" xmlns:w14="http://schemas.microsoft.com/office/word/2010/wordml" xmlns:w15="http://schemas.microsoft.com/office/word/2012/wordml" xmlns:w16se="http://schemas.microsoft.com/office/word/2015/wordml/symex" xmlns:wpg="http://schemas.microsoft.com/office/word/2010/wordprocessingGroup" xmlns:wpi="http://schemas.microsoft.com/office/word/2010/wordprocessingInk" xmlns:wne="http://schemas.microsoft.com/office/word/2006/wordml" xmlns:wps="http://schemas.microsoft.com/office/word/2010/wordprocessingShape" mc:Ignorable="w14 w15 w16se wp14">
+<w:ftr xmlns:wpc="http://schemas.microsoft.com/office/word/2010/wordprocessingCanvas" xmlns:cx="http://schemas.microsoft.com/office/drawing/2014/chartex" xmlns:cx1="http://schemas.microsoft.com/office/drawing/2015/9/8/chartex" xmlns:cx2="http://schemas.microsoft.com/office/drawing/2015/10/21/chartex" xmlns:cx3="http://schemas.microsoft.com/office/drawing/2016/5/9/chartex" xmlns:cx4="http://schemas.microsoft.com/office/drawing/2016/5/10/chartex" xmlns:cx5="http://schemas.microsoft.com/office/drawing/2016/5/11/chartex" xmlns:cx6="http://schemas.microsoft.com/office/drawing/2016/5/12/chartex" xmlns:cx7="http://schemas.microsoft.com/office/drawing/2016/5/13/chartex" xmlns:cx8="http://schemas.microsoft.com/office/drawing/2016/5/14/chartex" xmlns:mc="http://schemas.openxmlformats.org/markup-compatibility/2006" xmlns:aink="http://schemas.microsoft.com/office/drawing/2016/ink" xmlns:am3d="http://schemas.microsoft.com/office/drawing/2017/model3d" xmlns:o="urn:schemas-microsoft-com:office:office" xmlns:oel="http://schemas.microsoft.com/office/2019/extlst" xmlns:r="http://schemas.openxmlformats.org/officeDocument/2006/relationships" xmlns:m="http://schemas.openxmlformats.org/officeDocument/2006/math" xmlns:v="urn:schemas-microsoft-com:vml" xmlns:wp14="http://schemas.microsoft.com/office/word/2010/wordprocessingDrawing" xmlns:wp="http://schemas.openxmlformats.org/drawingml/2006/wordprocessingDrawing" xmlns:w10="urn:schemas-microsoft-com:office:word" xmlns:w="http://schemas.openxmlformats.org/wordprocessingml/2006/main" xmlns:w14="http://schemas.microsoft.com/office/word/2010/wordml" xmlns:w15="http://schemas.microsoft.com/office/word/2012/wordml" xmlns:w16cex="http://schemas.microsoft.com/office/word/2018/wordml/cex" xmlns:w16cid="http://schemas.microsoft.com/office/word/2016/wordml/cid" xmlns:w16="http://schemas.microsoft.com/office/word/2018/wordml" xmlns:w16du="http://schemas.microsoft.com/office/word/2023/wordml/word16du" xmlns:w16sdtdh="http://schemas.microsoft.com/office/word/2020/wordml/sdtdatahash" xmlns:w16sdtfl="http://schemas.microsoft.com/office/word/2024/wordml/sdtformatlock" xmlns:w16se="http://schemas.microsoft.com/office/word/2015/wordml/symex" xmlns:wpg="http://schemas.microsoft.com/office/word/2010/wordprocessingGroup" xmlns:wpi="http://schemas.microsoft.com/office/word/2010/wordprocessingInk" xmlns:wne="http://schemas.microsoft.com/office/word/2006/wordml" xmlns:wps="http://schemas.microsoft.com/office/word/2010/wordprocessingShape" mc:Ignorable="w14 w15 w16se w16cid w16 w16cex w16sdtdh w16sdtfl w16du wp14">
   <w:sdt>
     <w:sdtPr>
       <w:id w:val="-937982979"/>
@@ -1306,7 +1322,6 @@
         <w:docPartUnique/>
       </w:docPartObj>
     </w:sdtPr>
-    <w:sdtEndPr/>
     <w:sdtContent>
       <w:p>
         <w:pPr>
@@ -1518,7 +1533,7 @@
             </mc:Choice>
             <mc:Fallback>
               <w:pict>
-                <v:group w14:anchorId="51D00065" id="Grupo 32" o:spid="_x0000_s1026" style="position:absolute;margin-left:0;margin-top:0;width:610.5pt;height:15pt;z-index:251659264;mso-width-percent:1000;mso-position-horizontal:center;mso-position-horizontal-relative:page;mso-position-vertical:center;mso-position-vertical-relative:bottom-margin-area;mso-width-percent:1000" coordorigin=",14970" coordsize="12255,300" o:gfxdata="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">
+                <v:group w14:anchorId="51D00065" id="Grupo 32" o:spid="_x0000_s1026" style="position:absolute;margin-left:0;margin-top:0;width:610.5pt;height:15pt;z-index:251659264;mso-width-percent:1000;mso-position-horizontal:center;mso-position-horizontal-relative:page;mso-position-vertical:center;mso-position-vertical-relative:bottom-margin-area;mso-width-percent:1000" coordorigin=",14970" coordsize="12255,300" o:gfxdata="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">
                   <v:shapetype id="_x0000_t202" coordsize="21600,21600" o:spt="202" path="m,l,21600r21600,l21600,xe">
                     <v:stroke joinstyle="miter"/>
                     <v:path gradientshapeok="t" o:connecttype="rect"/>
@@ -1585,7 +1600,7 @@
 </file>
 
 <file path=word/footnotes.xml><?xml version="1.0" encoding="utf-8"?>
-<w:footnotes xmlns:wpc="http://schemas.microsoft.com/office/word/2010/wordprocessingCanvas" xmlns:cx="http://schemas.microsoft.com/office/drawing/2014/chartex" xmlns:mc="http://schemas.openxmlformats.org/markup-compatibility/2006" xmlns:o="urn:schemas-microsoft-com:office:office" xmlns:r="http://schemas.openxmlformats.org/officeDocument/2006/relationships" xmlns:m="http://schemas.openxmlformats.org/officeDocument/2006/math" xmlns:v="urn:schemas-microsoft-com:vml" xmlns:wp14="http://schemas.microsoft.com/office/word/2010/wordprocessingDrawing" xmlns:wp="http://schemas.openxmlformats.org/drawingml/2006/wordprocessingDrawing" xmlns:w10="urn:schemas-microsoft-com:office:word" xmlns:w="http://schemas.openxmlformats.org/wordprocessingml/2006/main" xmlns:w14="http://schemas.microsoft.com/office/word/2010/wordml" xmlns:w15="http://schemas.microsoft.com/office/word/2012/wordml" xmlns:w16se="http://schemas.microsoft.com/office/word/2015/wordml/symex" xmlns:wpg="http://schemas.microsoft.com/office/word/2010/wordprocessingGroup" xmlns:wpi="http://schemas.microsoft.com/office/word/2010/wordprocessingInk" xmlns:wne="http://schemas.microsoft.com/office/word/2006/wordml" xmlns:wps="http://schemas.microsoft.com/office/word/2010/wordprocessingShape" mc:Ignorable="w14 w15 w16se wp14">
+<w:footnotes xmlns:wpc="http://schemas.microsoft.com/office/word/2010/wordprocessingCanvas" xmlns:cx="http://schemas.microsoft.com/office/drawing/2014/chartex" xmlns:cx1="http://schemas.microsoft.com/office/drawing/2015/9/8/chartex" xmlns:cx2="http://schemas.microsoft.com/office/drawing/2015/10/21/chartex" xmlns:cx3="http://schemas.microsoft.com/office/drawing/2016/5/9/chartex" xmlns:cx4="http://schemas.microsoft.com/office/drawing/2016/5/10/chartex" xmlns:cx5="http://schemas.microsoft.com/office/drawing/2016/5/11/chartex" xmlns:cx6="http://schemas.microsoft.com/office/drawing/2016/5/12/chartex" xmlns:cx7="http://schemas.microsoft.com/office/drawing/2016/5/13/chartex" xmlns:cx8="http://schemas.microsoft.com/office/drawing/2016/5/14/chartex" xmlns:mc="http://schemas.openxmlformats.org/markup-compatibility/2006" xmlns:aink="http://schemas.microsoft.com/office/drawing/2016/ink" xmlns:am3d="http://schemas.microsoft.com/office/drawing/2017/model3d" xmlns:o="urn:schemas-microsoft-com:office:office" xmlns:oel="http://schemas.microsoft.com/office/2019/extlst" xmlns:r="http://schemas.openxmlformats.org/officeDocument/2006/relationships" xmlns:m="http://schemas.openxmlformats.org/officeDocument/2006/math" xmlns:v="urn:schemas-microsoft-com:vml" xmlns:wp14="http://schemas.microsoft.com/office/word/2010/wordprocessingDrawing" xmlns:wp="http://schemas.openxmlformats.org/drawingml/2006/wordprocessingDrawing" xmlns:w10="urn:schemas-microsoft-com:office:word" xmlns:w="http://schemas.openxmlformats.org/wordprocessingml/2006/main" xmlns:w14="http://schemas.microsoft.com/office/word/2010/wordml" xmlns:w15="http://schemas.microsoft.com/office/word/2012/wordml" xmlns:w16cex="http://schemas.microsoft.com/office/word/2018/wordml/cex" xmlns:w16cid="http://schemas.microsoft.com/office/word/2016/wordml/cid" xmlns:w16="http://schemas.microsoft.com/office/word/2018/wordml" xmlns:w16du="http://schemas.microsoft.com/office/word/2023/wordml/word16du" xmlns:w16sdtdh="http://schemas.microsoft.com/office/word/2020/wordml/sdtdatahash" xmlns:w16sdtfl="http://schemas.microsoft.com/office/word/2024/wordml/sdtformatlock" xmlns:w16se="http://schemas.microsoft.com/office/word/2015/wordml/symex" xmlns:wpg="http://schemas.microsoft.com/office/word/2010/wordprocessingGroup" xmlns:wpi="http://schemas.microsoft.com/office/word/2010/wordprocessingInk" xmlns:wne="http://schemas.microsoft.com/office/word/2006/wordml" xmlns:wps="http://schemas.microsoft.com/office/word/2010/wordprocessingShape" mc:Ignorable="w14 w15 w16se w16cid w16 w16cex w16sdtdh w16sdtfl w16du wp14">
   <w:footnote w:type="separator" w:id="-1">
     <w:p>
       <w:pPr>
@@ -1610,7 +1625,7 @@
 </file>
 
 <file path=word/header1.xml><?xml version="1.0" encoding="utf-8"?>
-<w:hdr xmlns:wpc="http://schemas.microsoft.com/office/word/2010/wordprocessingCanvas" xmlns:cx="http://schemas.microsoft.com/office/drawing/2014/chartex" xmlns:mc="http://schemas.openxmlformats.org/markup-compatibility/2006" xmlns:o="urn:schemas-microsoft-com:office:office" xmlns:r="http://schemas.openxmlformats.org/officeDocument/2006/relationships" xmlns:m="http://schemas.openxmlformats.org/officeDocument/2006/math" xmlns:v="urn:schemas-microsoft-com:vml" xmlns:wp14="http://schemas.microsoft.com/office/word/2010/wordprocessingDrawing" xmlns:wp="http://schemas.openxmlformats.org/drawingml/2006/wordprocessingDrawing" xmlns:w10="urn:schemas-microsoft-com:office:word" xmlns:w="http://schemas.openxmlformats.org/wordprocessingml/2006/main" xmlns:w14="http://schemas.microsoft.com/office/word/2010/wordml" xmlns:w15="http://schemas.microsoft.com/office/word/2012/wordml" xmlns:w16se="http://schemas.microsoft.com/office/word/2015/wordml/symex" xmlns:wpg="http://schemas.microsoft.com/office/word/2010/wordprocessingGroup" xmlns:wpi="http://schemas.microsoft.com/office/word/2010/wordprocessingInk" xmlns:wne="http://schemas.microsoft.com/office/word/2006/wordml" xmlns:wps="http://schemas.microsoft.com/office/word/2010/wordprocessingShape" mc:Ignorable="w14 w15 w16se wp14">
+<w:hdr xmlns:wpc="http://schemas.microsoft.com/office/word/2010/wordprocessingCanvas" xmlns:cx="http://schemas.microsoft.com/office/drawing/2014/chartex" xmlns:cx1="http://schemas.microsoft.com/office/drawing/2015/9/8/chartex" xmlns:cx2="http://schemas.microsoft.com/office/drawing/2015/10/21/chartex" xmlns:cx3="http://schemas.microsoft.com/office/drawing/2016/5/9/chartex" xmlns:cx4="http://schemas.microsoft.com/office/drawing/2016/5/10/chartex" xmlns:cx5="http://schemas.microsoft.com/office/drawing/2016/5/11/chartex" xmlns:cx6="http://schemas.microsoft.com/office/drawing/2016/5/12/chartex" xmlns:cx7="http://schemas.microsoft.com/office/drawing/2016/5/13/chartex" xmlns:cx8="http://schemas.microsoft.com/office/drawing/2016/5/14/chartex" xmlns:mc="http://schemas.openxmlformats.org/markup-compatibility/2006" xmlns:aink="http://schemas.microsoft.com/office/drawing/2016/ink" xmlns:am3d="http://schemas.microsoft.com/office/drawing/2017/model3d" xmlns:o="urn:schemas-microsoft-com:office:office" xmlns:oel="http://schemas.microsoft.com/office/2019/extlst" xmlns:r="http://schemas.openxmlformats.org/officeDocument/2006/relationships" xmlns:m="http://schemas.openxmlformats.org/officeDocument/2006/math" xmlns:v="urn:schemas-microsoft-com:vml" xmlns:wp14="http://schemas.microsoft.com/office/word/2010/wordprocessingDrawing" xmlns:wp="http://schemas.openxmlformats.org/drawingml/2006/wordprocessingDrawing" xmlns:w10="urn:schemas-microsoft-com:office:word" xmlns:w="http://schemas.openxmlformats.org/wordprocessingml/2006/main" xmlns:w14="http://schemas.microsoft.com/office/word/2010/wordml" xmlns:w15="http://schemas.microsoft.com/office/word/2012/wordml" xmlns:w16cex="http://schemas.microsoft.com/office/word/2018/wordml/cex" xmlns:w16cid="http://schemas.microsoft.com/office/word/2016/wordml/cid" xmlns:w16="http://schemas.microsoft.com/office/word/2018/wordml" xmlns:w16du="http://schemas.microsoft.com/office/word/2023/wordml/word16du" xmlns:w16sdtdh="http://schemas.microsoft.com/office/word/2020/wordml/sdtdatahash" xmlns:w16sdtfl="http://schemas.microsoft.com/office/word/2024/wordml/sdtformatlock" xmlns:w16se="http://schemas.microsoft.com/office/word/2015/wordml/symex" xmlns:wpg="http://schemas.microsoft.com/office/word/2010/wordprocessingGroup" xmlns:wpi="http://schemas.microsoft.com/office/word/2010/wordprocessingInk" xmlns:wne="http://schemas.microsoft.com/office/word/2006/wordml" xmlns:wps="http://schemas.microsoft.com/office/word/2010/wordprocessingShape" mc:Ignorable="w14 w15 w16se w16cid w16 w16cex w16sdtdh w16sdtfl w16du wp14">
   <w:tbl>
     <w:tblPr>
       <w:tblStyle w:val="Tablaconcuadrcula"/>
@@ -1790,7 +1805,7 @@
 </file>
 
 <file path=word/header2.xml><?xml version="1.0" encoding="utf-8"?>
-<w:hdr xmlns:wpc="http://schemas.microsoft.com/office/word/2010/wordprocessingCanvas" xmlns:cx="http://schemas.microsoft.com/office/drawing/2014/chartex" xmlns:mc="http://schemas.openxmlformats.org/markup-compatibility/2006" xmlns:o="urn:schemas-microsoft-com:office:office" xmlns:r="http://schemas.openxmlformats.org/officeDocument/2006/relationships" xmlns:m="http://schemas.openxmlformats.org/officeDocument/2006/math" xmlns:v="urn:schemas-microsoft-com:vml" xmlns:wp14="http://schemas.microsoft.com/office/word/2010/wordprocessingDrawing" xmlns:wp="http://schemas.openxmlformats.org/drawingml/2006/wordprocessingDrawing" xmlns:w10="urn:schemas-microsoft-com:office:word" xmlns:w="http://schemas.openxmlformats.org/wordprocessingml/2006/main" xmlns:w14="http://schemas.microsoft.com/office/word/2010/wordml" xmlns:w15="http://schemas.microsoft.com/office/word/2012/wordml" xmlns:w16se="http://schemas.microsoft.com/office/word/2015/wordml/symex" xmlns:wpg="http://schemas.microsoft.com/office/word/2010/wordprocessingGroup" xmlns:wpi="http://schemas.microsoft.com/office/word/2010/wordprocessingInk" xmlns:wne="http://schemas.microsoft.com/office/word/2006/wordml" xmlns:wps="http://schemas.microsoft.com/office/word/2010/wordprocessingShape" mc:Ignorable="w14 w15 w16se wp14">
+<w:hdr xmlns:wpc="http://schemas.microsoft.com/office/word/2010/wordprocessingCanvas" xmlns:cx="http://schemas.microsoft.com/office/drawing/2014/chartex" xmlns:cx1="http://schemas.microsoft.com/office/drawing/2015/9/8/chartex" xmlns:cx2="http://schemas.microsoft.com/office/drawing/2015/10/21/chartex" xmlns:cx3="http://schemas.microsoft.com/office/drawing/2016/5/9/chartex" xmlns:cx4="http://schemas.microsoft.com/office/drawing/2016/5/10/chartex" xmlns:cx5="http://schemas.microsoft.com/office/drawing/2016/5/11/chartex" xmlns:cx6="http://schemas.microsoft.com/office/drawing/2016/5/12/chartex" xmlns:cx7="http://schemas.microsoft.com/office/drawing/2016/5/13/chartex" xmlns:cx8="http://schemas.microsoft.com/office/drawing/2016/5/14/chartex" xmlns:mc="http://schemas.openxmlformats.org/markup-compatibility/2006" xmlns:aink="http://schemas.microsoft.com/office/drawing/2016/ink" xmlns:am3d="http://schemas.microsoft.com/office/drawing/2017/model3d" xmlns:o="urn:schemas-microsoft-com:office:office" xmlns:oel="http://schemas.microsoft.com/office/2019/extlst" xmlns:r="http://schemas.openxmlformats.org/officeDocument/2006/relationships" xmlns:m="http://schemas.openxmlformats.org/officeDocument/2006/math" xmlns:v="urn:schemas-microsoft-com:vml" xmlns:wp14="http://schemas.microsoft.com/office/word/2010/wordprocessingDrawing" xmlns:wp="http://schemas.openxmlformats.org/drawingml/2006/wordprocessingDrawing" xmlns:w10="urn:schemas-microsoft-com:office:word" xmlns:w="http://schemas.openxmlformats.org/wordprocessingml/2006/main" xmlns:w14="http://schemas.microsoft.com/office/word/2010/wordml" xmlns:w15="http://schemas.microsoft.com/office/word/2012/wordml" xmlns:w16cex="http://schemas.microsoft.com/office/word/2018/wordml/cex" xmlns:w16cid="http://schemas.microsoft.com/office/word/2016/wordml/cid" xmlns:w16="http://schemas.microsoft.com/office/word/2018/wordml" xmlns:w16du="http://schemas.microsoft.com/office/word/2023/wordml/word16du" xmlns:w16sdtdh="http://schemas.microsoft.com/office/word/2020/wordml/sdtdatahash" xmlns:w16sdtfl="http://schemas.microsoft.com/office/word/2024/wordml/sdtformatlock" xmlns:w16se="http://schemas.microsoft.com/office/word/2015/wordml/symex" xmlns:wpg="http://schemas.microsoft.com/office/word/2010/wordprocessingGroup" xmlns:wpi="http://schemas.microsoft.com/office/word/2010/wordprocessingInk" xmlns:wne="http://schemas.microsoft.com/office/word/2006/wordml" xmlns:wps="http://schemas.microsoft.com/office/word/2010/wordprocessingShape" mc:Ignorable="w14 w15 w16se w16cid w16 w16cex w16sdtdh w16sdtfl w16du wp14">
   <w:tbl>
     <w:tblPr>
       <w:tblStyle w:val="Tablaconcuadrcula"/>
@@ -2065,7 +2080,7 @@
 </file>
 
 <file path=word/numbering.xml><?xml version="1.0" encoding="utf-8"?>
-<w:numbering xmlns:wpc="http://schemas.microsoft.com/office/word/2010/wordprocessingCanvas" xmlns:cx="http://schemas.microsoft.com/office/drawing/2014/chartex" xmlns:mc="http://schemas.openxmlformats.org/markup-compatibility/2006" xmlns:o="urn:schemas-microsoft-com:office:office" xmlns:r="http://schemas.openxmlformats.org/officeDocument/2006/relationships" xmlns:m="http://schemas.openxmlformats.org/officeDocument/2006/math" xmlns:v="urn:schemas-microsoft-com:vml" xmlns:wp14="http://schemas.microsoft.com/office/word/2010/wordprocessingDrawing" xmlns:wp="http://schemas.openxmlformats.org/drawingml/2006/wordprocessingDrawing" xmlns:w10="urn:schemas-microsoft-com:office:word" xmlns:w="http://schemas.openxmlformats.org/wordprocessingml/2006/main" xmlns:w14="http://schemas.microsoft.com/office/word/2010/wordml" xmlns:w15="http://schemas.microsoft.com/office/word/2012/wordml" xmlns:w16se="http://schemas.microsoft.com/office/word/2015/wordml/symex" xmlns:wpg="http://schemas.microsoft.com/office/word/2010/wordprocessingGroup" xmlns:wpi="http://schemas.microsoft.com/office/word/2010/wordprocessingInk" xmlns:wne="http://schemas.microsoft.com/office/word/2006/wordml" xmlns:wps="http://schemas.microsoft.com/office/word/2010/wordprocessingShape" mc:Ignorable="w14 w15 w16se wp14">
+<w:numbering xmlns:wpc="http://schemas.microsoft.com/office/word/2010/wordprocessingCanvas" xmlns:cx="http://schemas.microsoft.com/office/drawing/2014/chartex" xmlns:cx1="http://schemas.microsoft.com/office/drawing/2015/9/8/chartex" xmlns:cx2="http://schemas.microsoft.com/office/drawing/2015/10/21/chartex" xmlns:cx3="http://schemas.microsoft.com/office/drawing/2016/5/9/chartex" xmlns:cx4="http://schemas.microsoft.com/office/drawing/2016/5/10/chartex" xmlns:cx5="http://schemas.microsoft.com/office/drawing/2016/5/11/chartex" xmlns:cx6="http://schemas.microsoft.com/office/drawing/2016/5/12/chartex" xmlns:cx7="http://schemas.microsoft.com/office/drawing/2016/5/13/chartex" xmlns:cx8="http://schemas.microsoft.com/office/drawing/2016/5/14/chartex" xmlns:mc="http://schemas.openxmlformats.org/markup-compatibility/2006" xmlns:aink="http://schemas.microsoft.com/office/drawing/2016/ink" xmlns:am3d="http://schemas.microsoft.com/office/drawing/2017/model3d" xmlns:o="urn:schemas-microsoft-com:office:office" xmlns:oel="http://schemas.microsoft.com/office/2019/extlst" xmlns:r="http://schemas.openxmlformats.org/officeDocument/2006/relationships" xmlns:m="http://schemas.openxmlformats.org/officeDocument/2006/math" xmlns:v="urn:schemas-microsoft-com:vml" xmlns:wp14="http://schemas.microsoft.com/office/word/2010/wordprocessingDrawing" xmlns:wp="http://schemas.openxmlformats.org/drawingml/2006/wordprocessingDrawing" xmlns:w10="urn:schemas-microsoft-com:office:word" xmlns:w="http://schemas.openxmlformats.org/wordprocessingml/2006/main" xmlns:w14="http://schemas.microsoft.com/office/word/2010/wordml" xmlns:w15="http://schemas.microsoft.com/office/word/2012/wordml" xmlns:w16cex="http://schemas.microsoft.com/office/word/2018/wordml/cex" xmlns:w16cid="http://schemas.microsoft.com/office/word/2016/wordml/cid" xmlns:w16="http://schemas.microsoft.com/office/word/2018/wordml" xmlns:w16du="http://schemas.microsoft.com/office/word/2023/wordml/word16du" xmlns:w16sdtdh="http://schemas.microsoft.com/office/word/2020/wordml/sdtdatahash" xmlns:w16sdtfl="http://schemas.microsoft.com/office/word/2024/wordml/sdtformatlock" xmlns:w16se="http://schemas.microsoft.com/office/word/2015/wordml/symex" xmlns:wpg="http://schemas.microsoft.com/office/word/2010/wordprocessingGroup" xmlns:wpi="http://schemas.microsoft.com/office/word/2010/wordprocessingInk" xmlns:wne="http://schemas.microsoft.com/office/word/2006/wordml" xmlns:wps="http://schemas.microsoft.com/office/word/2010/wordprocessingShape" mc:Ignorable="w14 w15 w16se w16cid w16 w16cex w16sdtdh w16sdtfl w16du wp14">
   <w:abstractNum w:abstractNumId="0" w15:restartNumberingAfterBreak="0">
     <w:nsid w:val="049156A1"/>
     <w:multiLevelType w:val="hybridMultilevel"/>
@@ -6639,124 +6654,124 @@
       </w:rPr>
     </w:lvl>
   </w:abstractNum>
-  <w:num w:numId="1">
+  <w:num w:numId="1" w16cid:durableId="1210412842">
     <w:abstractNumId w:val="3"/>
   </w:num>
-  <w:num w:numId="2">
+  <w:num w:numId="2" w16cid:durableId="1956985192">
     <w:abstractNumId w:val="8"/>
   </w:num>
-  <w:num w:numId="3">
+  <w:num w:numId="3" w16cid:durableId="1556503400">
     <w:abstractNumId w:val="12"/>
   </w:num>
-  <w:num w:numId="4">
+  <w:num w:numId="4" w16cid:durableId="1618289489">
     <w:abstractNumId w:val="28"/>
   </w:num>
-  <w:num w:numId="5">
+  <w:num w:numId="5" w16cid:durableId="99034172">
     <w:abstractNumId w:val="30"/>
   </w:num>
-  <w:num w:numId="6">
+  <w:num w:numId="6" w16cid:durableId="831989625">
     <w:abstractNumId w:val="4"/>
   </w:num>
-  <w:num w:numId="7">
+  <w:num w:numId="7" w16cid:durableId="140926124">
     <w:abstractNumId w:val="11"/>
   </w:num>
-  <w:num w:numId="8">
+  <w:num w:numId="8" w16cid:durableId="1634869857">
     <w:abstractNumId w:val="19"/>
   </w:num>
-  <w:num w:numId="9">
+  <w:num w:numId="9" w16cid:durableId="737291735">
     <w:abstractNumId w:val="15"/>
   </w:num>
-  <w:num w:numId="10">
+  <w:num w:numId="10" w16cid:durableId="1857034825">
     <w:abstractNumId w:val="9"/>
   </w:num>
-  <w:num w:numId="11">
+  <w:num w:numId="11" w16cid:durableId="1430273026">
     <w:abstractNumId w:val="24"/>
   </w:num>
-  <w:num w:numId="12">
+  <w:num w:numId="12" w16cid:durableId="24717247">
     <w:abstractNumId w:val="35"/>
   </w:num>
-  <w:num w:numId="13">
+  <w:num w:numId="13" w16cid:durableId="1571229218">
     <w:abstractNumId w:val="29"/>
   </w:num>
-  <w:num w:numId="14">
+  <w:num w:numId="14" w16cid:durableId="1001741800">
     <w:abstractNumId w:val="1"/>
   </w:num>
-  <w:num w:numId="15">
+  <w:num w:numId="15" w16cid:durableId="2099671008">
     <w:abstractNumId w:val="36"/>
   </w:num>
-  <w:num w:numId="16">
+  <w:num w:numId="16" w16cid:durableId="1615333226">
     <w:abstractNumId w:val="21"/>
   </w:num>
-  <w:num w:numId="17">
+  <w:num w:numId="17" w16cid:durableId="416682189">
     <w:abstractNumId w:val="17"/>
   </w:num>
-  <w:num w:numId="18">
+  <w:num w:numId="18" w16cid:durableId="2109424458">
     <w:abstractNumId w:val="31"/>
   </w:num>
-  <w:num w:numId="19">
+  <w:num w:numId="19" w16cid:durableId="356546897">
     <w:abstractNumId w:val="10"/>
   </w:num>
-  <w:num w:numId="20">
+  <w:num w:numId="20" w16cid:durableId="1302538557">
     <w:abstractNumId w:val="39"/>
   </w:num>
-  <w:num w:numId="21">
+  <w:num w:numId="21" w16cid:durableId="326592785">
     <w:abstractNumId w:val="34"/>
   </w:num>
-  <w:num w:numId="22">
+  <w:num w:numId="22" w16cid:durableId="1118522184">
     <w:abstractNumId w:val="13"/>
   </w:num>
-  <w:num w:numId="23">
+  <w:num w:numId="23" w16cid:durableId="1655986936">
     <w:abstractNumId w:val="14"/>
   </w:num>
-  <w:num w:numId="24">
+  <w:num w:numId="24" w16cid:durableId="1418483523">
     <w:abstractNumId w:val="5"/>
   </w:num>
-  <w:num w:numId="25">
+  <w:num w:numId="25" w16cid:durableId="1069426843">
     <w:abstractNumId w:val="16"/>
   </w:num>
-  <w:num w:numId="26">
+  <w:num w:numId="26" w16cid:durableId="759332338">
     <w:abstractNumId w:val="20"/>
   </w:num>
-  <w:num w:numId="27">
+  <w:num w:numId="27" w16cid:durableId="802120199">
     <w:abstractNumId w:val="23"/>
   </w:num>
-  <w:num w:numId="28">
+  <w:num w:numId="28" w16cid:durableId="6642757">
     <w:abstractNumId w:val="0"/>
   </w:num>
-  <w:num w:numId="29">
+  <w:num w:numId="29" w16cid:durableId="566306398">
     <w:abstractNumId w:val="18"/>
   </w:num>
-  <w:num w:numId="30">
+  <w:num w:numId="30" w16cid:durableId="658116150">
     <w:abstractNumId w:val="22"/>
   </w:num>
-  <w:num w:numId="31">
+  <w:num w:numId="31" w16cid:durableId="1019351427">
     <w:abstractNumId w:val="2"/>
   </w:num>
-  <w:num w:numId="32">
+  <w:num w:numId="32" w16cid:durableId="852184819">
     <w:abstractNumId w:val="7"/>
   </w:num>
-  <w:num w:numId="33">
+  <w:num w:numId="33" w16cid:durableId="493838116">
     <w:abstractNumId w:val="32"/>
   </w:num>
-  <w:num w:numId="34">
+  <w:num w:numId="34" w16cid:durableId="209077213">
     <w:abstractNumId w:val="38"/>
   </w:num>
-  <w:num w:numId="35">
+  <w:num w:numId="35" w16cid:durableId="248203015">
     <w:abstractNumId w:val="6"/>
   </w:num>
-  <w:num w:numId="36">
+  <w:num w:numId="36" w16cid:durableId="1313486262">
     <w:abstractNumId w:val="25"/>
   </w:num>
-  <w:num w:numId="37">
+  <w:num w:numId="37" w16cid:durableId="1945309269">
     <w:abstractNumId w:val="37"/>
   </w:num>
-  <w:num w:numId="38">
+  <w:num w:numId="38" w16cid:durableId="947855536">
     <w:abstractNumId w:val="27"/>
   </w:num>
-  <w:num w:numId="39">
+  <w:num w:numId="39" w16cid:durableId="404688336">
     <w:abstractNumId w:val="26"/>
   </w:num>
-  <w:num w:numId="40">
+  <w:num w:numId="40" w16cid:durableId="908153833">
     <w:abstractNumId w:val="33"/>
   </w:num>
   <w:numIdMacAtCleanup w:val="18"/>
@@ -6764,7 +6779,7 @@
 </file>
 
 <file path=word/styles.xml><?xml version="1.0" encoding="utf-8"?>
-<w:styles xmlns:mc="http://schemas.openxmlformats.org/markup-compatibility/2006" xmlns:r="http://schemas.openxmlformats.org/officeDocument/2006/relationships" xmlns:w="http://schemas.openxmlformats.org/wordprocessingml/2006/main" xmlns:w14="http://schemas.microsoft.com/office/word/2010/wordml" xmlns:w15="http://schemas.microsoft.com/office/word/2012/wordml" xmlns:w16se="http://schemas.microsoft.com/office/word/2015/wordml/symex" mc:Ignorable="w14 w15 w16se">
+<w:styles xmlns:mc="http://schemas.openxmlformats.org/markup-compatibility/2006" xmlns:r="http://schemas.openxmlformats.org/officeDocument/2006/relationships" xmlns:w="http://schemas.openxmlformats.org/wordprocessingml/2006/main" xmlns:w14="http://schemas.microsoft.com/office/word/2010/wordml" xmlns:w15="http://schemas.microsoft.com/office/word/2012/wordml" xmlns:w16cex="http://schemas.microsoft.com/office/word/2018/wordml/cex" xmlns:w16cid="http://schemas.microsoft.com/office/word/2016/wordml/cid" xmlns:w16="http://schemas.microsoft.com/office/word/2018/wordml" xmlns:w16du="http://schemas.microsoft.com/office/word/2023/wordml/word16du" xmlns:w16sdtdh="http://schemas.microsoft.com/office/word/2020/wordml/sdtdatahash" xmlns:w16sdtfl="http://schemas.microsoft.com/office/word/2024/wordml/sdtformatlock" xmlns:w16se="http://schemas.microsoft.com/office/word/2015/wordml/symex" mc:Ignorable="w14 w15 w16se w16cid w16 w16cex w16sdtdh w16sdtfl w16du">
   <w:docDefaults>
     <w:rPrDefault>
       <w:rPr>
@@ -6780,7 +6795,7 @@
       </w:pPr>
     </w:pPrDefault>
   </w:docDefaults>
-  <w:latentStyles w:defLockedState="0" w:defUIPriority="99" w:defSemiHidden="0" w:defUnhideWhenUsed="0" w:defQFormat="0" w:count="371">
+  <w:latentStyles w:defLockedState="0" w:defUIPriority="99" w:defSemiHidden="0" w:defUnhideWhenUsed="0" w:defQFormat="0" w:count="376">
     <w:lsdException w:name="Normal" w:uiPriority="0" w:qFormat="1"/>
     <w:lsdException w:name="heading 1" w:uiPriority="9" w:qFormat="1"/>
     <w:lsdException w:name="heading 2" w:semiHidden="1" w:uiPriority="9" w:unhideWhenUsed="1" w:qFormat="1"/>
@@ -7152,6 +7167,11 @@
     <w:lsdException w:name="List Table 5 Dark Accent 6" w:uiPriority="50"/>
     <w:lsdException w:name="List Table 6 Colorful Accent 6" w:uiPriority="51"/>
     <w:lsdException w:name="List Table 7 Colorful Accent 6" w:uiPriority="52"/>
+    <w:lsdException w:name="Mention" w:semiHidden="1" w:unhideWhenUsed="1"/>
+    <w:lsdException w:name="Smart Hyperlink" w:semiHidden="1" w:unhideWhenUsed="1"/>
+    <w:lsdException w:name="Hashtag" w:semiHidden="1" w:unhideWhenUsed="1"/>
+    <w:lsdException w:name="Unresolved Mention" w:semiHidden="1" w:unhideWhenUsed="1"/>
+    <w:lsdException w:name="Smart Link" w:semiHidden="1" w:unhideWhenUsed="1"/>
   </w:latentStyles>
   <w:style w:type="paragraph" w:default="1" w:styleId="Normal">
     <w:name w:val="Normal"/>
@@ -7225,7 +7245,6 @@
   <w:style w:type="character" w:default="1" w:styleId="Fuentedeprrafopredeter">
     <w:name w:val="Default Paragraph Font"/>
     <w:uiPriority w:val="1"/>
-    <w:semiHidden/>
     <w:unhideWhenUsed/>
   </w:style>
   <w:style w:type="table" w:default="1" w:styleId="Tablanormal">
@@ -8135,7 +8154,7 @@
       <w:szCs w:val="24"/>
     </w:rPr>
   </w:style>
-  <w:style w:type="table" w:styleId="Cuadrculadetablaclara">
+  <w:style w:type="table" w:styleId="Tablaconcuadrculaclara">
     <w:name w:val="Grid Table Light"/>
     <w:basedOn w:val="Tablanormal"/>
     <w:uiPriority w:val="40"/>
@@ -8157,7 +8176,7 @@
   <w:style w:type="table" w:customStyle="1" w:styleId="Cuadrculadetablaclara1">
     <w:name w:val="Cuadrícula de tabla clara1"/>
     <w:basedOn w:val="Tablanormal"/>
-    <w:next w:val="Cuadrculadetablaclara"/>
+    <w:next w:val="Tablaconcuadrculaclara"/>
     <w:uiPriority w:val="40"/>
     <w:rsid w:val="00943DF1"/>
     <w:pPr>
@@ -8198,7 +8217,7 @@
       <w:spacing w:after="0" w:line="240" w:lineRule="auto"/>
     </w:pPr>
   </w:style>
-  <w:style w:type="character" w:styleId="Textoennegrita">
+  <w:style w:type="character" w:styleId="Fuerte">
     <w:name w:val="Strong"/>
     <w:basedOn w:val="Fuentedeprrafopredeter"/>
     <w:uiPriority w:val="22"/>
@@ -8210,532 +8229,6 @@
     </w:rPr>
   </w:style>
 </w:styles>
-</file>
-
-<file path=word/glossary/document.xml><?xml version="1.0" encoding="utf-8"?>
-<w:glossaryDocument xmlns:wpc="http://schemas.microsoft.com/office/word/2010/wordprocessingCanvas" xmlns:cx="http://schemas.microsoft.com/office/drawing/2014/chartex" xmlns:mc="http://schemas.openxmlformats.org/markup-compatibility/2006" xmlns:o="urn:schemas-microsoft-com:office:office" xmlns:r="http://schemas.openxmlformats.org/officeDocument/2006/relationships" xmlns:m="http://schemas.openxmlformats.org/officeDocument/2006/math" xmlns:v="urn:schemas-microsoft-com:vml" xmlns:wp14="http://schemas.microsoft.com/office/word/2010/wordprocessingDrawing" xmlns:wp="http://schemas.openxmlformats.org/drawingml/2006/wordprocessingDrawing" xmlns:w10="urn:schemas-microsoft-com:office:word" xmlns:w="http://schemas.openxmlformats.org/wordprocessingml/2006/main" xmlns:w14="http://schemas.microsoft.com/office/word/2010/wordml" xmlns:w15="http://schemas.microsoft.com/office/word/2012/wordml" xmlns:w16se="http://schemas.microsoft.com/office/word/2015/wordml/symex" xmlns:wpg="http://schemas.microsoft.com/office/word/2010/wordprocessingGroup" xmlns:wpi="http://schemas.microsoft.com/office/word/2010/wordprocessingInk" xmlns:wne="http://schemas.microsoft.com/office/word/2006/wordml" xmlns:wps="http://schemas.microsoft.com/office/word/2010/wordprocessingShape" mc:Ignorable="w14 w15 w16se wp14"/>
-</file>
-
-<file path=word/glossary/fontTable.xml><?xml version="1.0" encoding="utf-8"?>
-<w:fonts xmlns:mc="http://schemas.openxmlformats.org/markup-compatibility/2006" xmlns:r="http://schemas.openxmlformats.org/officeDocument/2006/relationships" xmlns:w="http://schemas.openxmlformats.org/wordprocessingml/2006/main" xmlns:w14="http://schemas.microsoft.com/office/word/2010/wordml" xmlns:w15="http://schemas.microsoft.com/office/word/2012/wordml" xmlns:w16se="http://schemas.microsoft.com/office/word/2015/wordml/symex" mc:Ignorable="w14 w15 w16se">
-  <w:font w:name="Calibri">
-    <w:panose1 w:val="020F0502020204030204"/>
-    <w:charset w:val="00"/>
-    <w:family w:val="swiss"/>
-    <w:pitch w:val="variable"/>
-    <w:sig w:usb0="E4002EFF" w:usb1="C000247B" w:usb2="00000009" w:usb3="00000000" w:csb0="000001FF" w:csb1="00000000"/>
-  </w:font>
-  <w:font w:name="Times New Roman">
-    <w:panose1 w:val="02020603050405020304"/>
-    <w:charset w:val="00"/>
-    <w:family w:val="roman"/>
-    <w:pitch w:val="variable"/>
-    <w:sig w:usb0="E0002EFF" w:usb1="C000785B" w:usb2="00000009" w:usb3="00000000" w:csb0="000001FF" w:csb1="00000000"/>
-  </w:font>
-  <w:font w:name="Courier New">
-    <w:panose1 w:val="02070309020205020404"/>
-    <w:charset w:val="00"/>
-    <w:family w:val="modern"/>
-    <w:pitch w:val="fixed"/>
-    <w:sig w:usb0="E0002EFF" w:usb1="C0007843" w:usb2="00000009" w:usb3="00000000" w:csb0="000001FF" w:csb1="00000000"/>
-  </w:font>
-  <w:font w:name="Wingdings">
-    <w:panose1 w:val="05000000000000000000"/>
-    <w:charset w:val="02"/>
-    <w:family w:val="auto"/>
-    <w:pitch w:val="variable"/>
-    <w:sig w:usb0="00000000" w:usb1="10000000" w:usb2="00000000" w:usb3="00000000" w:csb0="80000000" w:csb1="00000000"/>
-  </w:font>
-  <w:font w:name="Symbol">
-    <w:panose1 w:val="05050102010706020507"/>
-    <w:charset w:val="02"/>
-    <w:family w:val="roman"/>
-    <w:pitch w:val="variable"/>
-    <w:sig w:usb0="00000000" w:usb1="10000000" w:usb2="00000000" w:usb3="00000000" w:csb0="80000000" w:csb1="00000000"/>
-  </w:font>
-  <w:font w:name="Calibri Light">
-    <w:panose1 w:val="020F0302020204030204"/>
-    <w:charset w:val="00"/>
-    <w:family w:val="swiss"/>
-    <w:pitch w:val="variable"/>
-    <w:sig w:usb0="E4002EFF" w:usb1="C000247B" w:usb2="00000009" w:usb3="00000000" w:csb0="000001FF" w:csb1="00000000"/>
-  </w:font>
-  <w:font w:name="Segoe UI">
-    <w:panose1 w:val="020B0502040204020203"/>
-    <w:charset w:val="00"/>
-    <w:family w:val="swiss"/>
-    <w:pitch w:val="variable"/>
-    <w:sig w:usb0="E4002EFF" w:usb1="C000E47F" w:usb2="00000009" w:usb3="00000000" w:csb0="000001FF" w:csb1="00000000"/>
-  </w:font>
-  <w:font w:name="Century Gothic">
-    <w:panose1 w:val="020B0502020202020204"/>
-    <w:charset w:val="00"/>
-    <w:family w:val="swiss"/>
-    <w:pitch w:val="variable"/>
-    <w:sig w:usb0="00000287" w:usb1="00000000" w:usb2="00000000" w:usb3="00000000" w:csb0="0000009F" w:csb1="00000000"/>
-  </w:font>
-</w:fonts>
-</file>
-
-<file path=word/glossary/settings.xml><?xml version="1.0" encoding="utf-8"?>
-<w:settings xmlns:mc="http://schemas.openxmlformats.org/markup-compatibility/2006" xmlns:o="urn:schemas-microsoft-com:office:office" xmlns:r="http://schemas.openxmlformats.org/officeDocument/2006/relationships" xmlns:m="http://schemas.openxmlformats.org/officeDocument/2006/math" xmlns:v="urn:schemas-microsoft-com:vml" xmlns:w10="urn:schemas-microsoft-com:office:word" xmlns:w="http://schemas.openxmlformats.org/wordprocessingml/2006/main" xmlns:w14="http://schemas.microsoft.com/office/word/2010/wordml" xmlns:w15="http://schemas.microsoft.com/office/word/2012/wordml" xmlns:w16se="http://schemas.microsoft.com/office/word/2015/wordml/symex" xmlns:sl="http://schemas.openxmlformats.org/schemaLibrary/2006/main" mc:Ignorable="w14 w15 w16se">
-  <w:defaultTabStop w:val="708"/>
-  <w:hyphenationZone w:val="425"/>
-  <w:characterSpacingControl w:val="doNotCompress"/>
-  <w:compat>
-    <w:useFELayout/>
-    <w:compatSetting w:name="compatibilityMode" w:uri="http://schemas.microsoft.com/office/word" w:val="12"/>
-  </w:compat>
-  <w:rsids>
-    <w:rsidRoot w:val="008F14D6"/>
-    <w:rsid w:val="008F14D6"/>
-  </w:rsids>
-  <m:mathPr>
-    <m:mathFont m:val="Cambria Math"/>
-    <m:brkBin m:val="before"/>
-    <m:brkBinSub m:val="--"/>
-    <m:smallFrac m:val="0"/>
-    <m:dispDef/>
-    <m:lMargin m:val="0"/>
-    <m:rMargin m:val="0"/>
-    <m:defJc m:val="centerGroup"/>
-    <m:wrapIndent m:val="1440"/>
-    <m:intLim m:val="subSup"/>
-    <m:naryLim m:val="undOvr"/>
-  </m:mathPr>
-  <w:themeFontLang w:val="es-CL"/>
-  <w:clrSchemeMapping w:bg1="light1" w:t1="dark1" w:bg2="light2" w:t2="dark2" w:accent1="accent1" w:accent2="accent2" w:accent3="accent3" w:accent4="accent4" w:accent5="accent5" w:accent6="accent6" w:hyperlink="hyperlink" w:followedHyperlink="followedHyperlink"/>
-  <w:decimalSymbol w:val=","/>
-  <w:listSeparator w:val=";"/>
-</w:settings>
-</file>
-
-<file path=word/glossary/styles.xml><?xml version="1.0" encoding="utf-8"?>
-<w:styles xmlns:mc="http://schemas.openxmlformats.org/markup-compatibility/2006" xmlns:r="http://schemas.openxmlformats.org/officeDocument/2006/relationships" xmlns:w="http://schemas.openxmlformats.org/wordprocessingml/2006/main" xmlns:w14="http://schemas.microsoft.com/office/word/2010/wordml" xmlns:w15="http://schemas.microsoft.com/office/word/2012/wordml" xmlns:w16se="http://schemas.microsoft.com/office/word/2015/wordml/symex" mc:Ignorable="w14 w15 w16se">
-  <w:docDefaults>
-    <w:rPrDefault>
-      <w:rPr>
-        <w:rFonts w:asciiTheme="minorHAnsi" w:eastAsiaTheme="minorEastAsia" w:hAnsiTheme="minorHAnsi" w:cstheme="minorBidi"/>
-        <w:sz w:val="22"/>
-        <w:szCs w:val="22"/>
-        <w:lang w:val="es-CL" w:eastAsia="es-CL" w:bidi="ar-SA"/>
-      </w:rPr>
-    </w:rPrDefault>
-    <w:pPrDefault>
-      <w:pPr>
-        <w:spacing w:after="160" w:line="259" w:lineRule="auto"/>
-      </w:pPr>
-    </w:pPrDefault>
-  </w:docDefaults>
-  <w:latentStyles w:defLockedState="0" w:defUIPriority="99" w:defSemiHidden="0" w:defUnhideWhenUsed="0" w:defQFormat="0" w:count="371">
-    <w:lsdException w:name="Normal" w:uiPriority="0" w:qFormat="1"/>
-    <w:lsdException w:name="heading 1" w:uiPriority="9" w:qFormat="1"/>
-    <w:lsdException w:name="heading 2" w:semiHidden="1" w:uiPriority="9" w:unhideWhenUsed="1" w:qFormat="1"/>
-    <w:lsdException w:name="heading 3" w:semiHidden="1" w:uiPriority="9" w:unhideWhenUsed="1" w:qFormat="1"/>
-    <w:lsdException w:name="heading 4" w:semiHidden="1" w:uiPriority="9" w:unhideWhenUsed="1" w:qFormat="1"/>
-    <w:lsdException w:name="heading 5" w:semiHidden="1" w:uiPriority="9" w:unhideWhenUsed="1" w:qFormat="1"/>
-    <w:lsdException w:name="heading 6" w:semiHidden="1" w:uiPriority="9" w:unhideWhenUsed="1" w:qFormat="1"/>
-    <w:lsdException w:name="heading 7" w:semiHidden="1" w:uiPriority="9" w:unhideWhenUsed="1" w:qFormat="1"/>
-    <w:lsdException w:name="heading 8" w:semiHidden="1" w:uiPriority="9" w:unhideWhenUsed="1" w:qFormat="1"/>
-    <w:lsdException w:name="heading 9" w:semiHidden="1" w:uiPriority="9" w:unhideWhenUsed="1" w:qFormat="1"/>
-    <w:lsdException w:name="index 1" w:semiHidden="1" w:unhideWhenUsed="1"/>
-    <w:lsdException w:name="index 2" w:semiHidden="1" w:unhideWhenUsed="1"/>
-    <w:lsdException w:name="index 3" w:semiHidden="1" w:unhideWhenUsed="1"/>
-    <w:lsdException w:name="index 4" w:semiHidden="1" w:unhideWhenUsed="1"/>
-    <w:lsdException w:name="index 5" w:semiHidden="1" w:unhideWhenUsed="1"/>
-    <w:lsdException w:name="index 6" w:semiHidden="1" w:unhideWhenUsed="1"/>
-    <w:lsdException w:name="index 7" w:semiHidden="1" w:unhideWhenUsed="1"/>
-    <w:lsdException w:name="index 8" w:semiHidden="1" w:unhideWhenUsed="1"/>
-    <w:lsdException w:name="index 9" w:semiHidden="1" w:unhideWhenUsed="1"/>
-    <w:lsdException w:name="toc 1" w:semiHidden="1" w:uiPriority="39" w:unhideWhenUsed="1"/>
-    <w:lsdException w:name="toc 2" w:semiHidden="1" w:uiPriority="39" w:unhideWhenUsed="1"/>
-    <w:lsdException w:name="toc 3" w:semiHidden="1" w:uiPriority="39" w:unhideWhenUsed="1"/>
-    <w:lsdException w:name="toc 4" w:semiHidden="1" w:uiPriority="39" w:unhideWhenUsed="1"/>
-    <w:lsdException w:name="toc 5" w:semiHidden="1" w:uiPriority="39" w:unhideWhenUsed="1"/>
-    <w:lsdException w:name="toc 6" w:semiHidden="1" w:uiPriority="39" w:unhideWhenUsed="1"/>
-    <w:lsdException w:name="toc 7" w:semiHidden="1" w:uiPriority="39" w:unhideWhenUsed="1"/>
-    <w:lsdException w:name="toc 8" w:semiHidden="1" w:uiPriority="39" w:unhideWhenUsed="1"/>
-    <w:lsdException w:name="toc 9" w:semiHidden="1" w:uiPriority="39" w:unhideWhenUsed="1"/>
-    <w:lsdException w:name="Normal Indent" w:semiHidden="1" w:unhideWhenUsed="1"/>
-    <w:lsdException w:name="footnote text" w:semiHidden="1" w:unhideWhenUsed="1"/>
-    <w:lsdException w:name="annotation text" w:semiHidden="1" w:unhideWhenUsed="1"/>
-    <w:lsdException w:name="header" w:semiHidden="1" w:unhideWhenUsed="1"/>
-    <w:lsdException w:name="footer" w:semiHidden="1" w:unhideWhenUsed="1"/>
-    <w:lsdException w:name="index heading" w:semiHidden="1" w:unhideWhenUsed="1"/>
-    <w:lsdException w:name="caption" w:semiHidden="1" w:uiPriority="35" w:unhideWhenUsed="1" w:qFormat="1"/>
-    <w:lsdException w:name="table of figures" w:semiHidden="1" w:unhideWhenUsed="1"/>
-    <w:lsdException w:name="envelope address" w:semiHidden="1" w:unhideWhenUsed="1"/>
-    <w:lsdException w:name="envelope return" w:semiHidden="1" w:unhideWhenUsed="1"/>
-    <w:lsdException w:name="footnote reference" w:semiHidden="1" w:unhideWhenUsed="1"/>
-    <w:lsdException w:name="annotation reference" w:semiHidden="1" w:unhideWhenUsed="1"/>
-    <w:lsdException w:name="line number" w:semiHidden="1" w:unhideWhenUsed="1"/>
-    <w:lsdException w:name="page number" w:semiHidden="1" w:unhideWhenUsed="1"/>
-    <w:lsdException w:name="endnote reference" w:semiHidden="1" w:unhideWhenUsed="1"/>
-    <w:lsdException w:name="endnote text" w:semiHidden="1" w:unhideWhenUsed="1"/>
-    <w:lsdException w:name="table of authorities" w:semiHidden="1" w:unhideWhenUsed="1"/>
-    <w:lsdException w:name="macro" w:semiHidden="1" w:unhideWhenUsed="1"/>
-    <w:lsdException w:name="toa heading" w:semiHidden="1" w:unhideWhenUsed="1"/>
-    <w:lsdException w:name="List" w:semiHidden="1" w:unhideWhenUsed="1"/>
-    <w:lsdException w:name="List Bullet" w:semiHidden="1" w:unhideWhenUsed="1"/>
-    <w:lsdException w:name="List Number" w:semiHidden="1" w:unhideWhenUsed="1"/>
-    <w:lsdException w:name="List 2" w:semiHidden="1" w:unhideWhenUsed="1"/>
-    <w:lsdException w:name="List 3" w:semiHidden="1" w:unhideWhenUsed="1"/>
-    <w:lsdException w:name="List 4" w:semiHidden="1" w:unhideWhenUsed="1"/>
-    <w:lsdException w:name="List 5" w:semiHidden="1" w:unhideWhenUsed="1"/>
-    <w:lsdException w:name="List Bullet 2" w:semiHidden="1" w:unhideWhenUsed="1"/>
-    <w:lsdException w:name="List Bullet 3" w:semiHidden="1" w:unhideWhenUsed="1"/>
-    <w:lsdException w:name="List Bullet 4" w:semiHidden="1" w:unhideWhenUsed="1"/>
-    <w:lsdException w:name="List Bullet 5" w:semiHidden="1" w:unhideWhenUsed="1"/>
-    <w:lsdException w:name="List Number 2" w:semiHidden="1" w:unhideWhenUsed="1"/>
-    <w:lsdException w:name="List Number 3" w:semiHidden="1" w:unhideWhenUsed="1"/>
-    <w:lsdException w:name="List Number 4" w:semiHidden="1" w:unhideWhenUsed="1"/>
-    <w:lsdException w:name="List Number 5" w:semiHidden="1" w:unhideWhenUsed="1"/>
-    <w:lsdException w:name="Title" w:uiPriority="10" w:qFormat="1"/>
-    <w:lsdException w:name="Closing" w:semiHidden="1" w:unhideWhenUsed="1"/>
-    <w:lsdException w:name="Signature" w:semiHidden="1" w:unhideWhenUsed="1"/>
-    <w:lsdException w:name="Default Paragraph Font" w:semiHidden="1" w:uiPriority="1" w:unhideWhenUsed="1"/>
-    <w:lsdException w:name="Body Text" w:semiHidden="1" w:unhideWhenUsed="1"/>
-    <w:lsdException w:name="Body Text Indent" w:semiHidden="1" w:unhideWhenUsed="1"/>
-    <w:lsdException w:name="List Continue" w:semiHidden="1" w:unhideWhenUsed="1"/>
-    <w:lsdException w:name="List Continue 2" w:semiHidden="1" w:unhideWhenUsed="1"/>
-    <w:lsdException w:name="List Continue 3" w:semiHidden="1" w:unhideWhenUsed="1"/>
-    <w:lsdException w:name="List Continue 4" w:semiHidden="1" w:unhideWhenUsed="1"/>
-    <w:lsdException w:name="List Continue 5" w:semiHidden="1" w:unhideWhenUsed="1"/>
-    <w:lsdException w:name="Message Header" w:semiHidden="1" w:unhideWhenUsed="1"/>
-    <w:lsdException w:name="Subtitle" w:uiPriority="11" w:qFormat="1"/>
-    <w:lsdException w:name="Salutation" w:semiHidden="1" w:unhideWhenUsed="1"/>
-    <w:lsdException w:name="Date" w:semiHidden="1" w:unhideWhenUsed="1"/>
-    <w:lsdException w:name="Body Text First Indent" w:semiHidden="1" w:unhideWhenUsed="1"/>
-    <w:lsdException w:name="Body Text First Indent 2" w:semiHidden="1" w:unhideWhenUsed="1"/>
-    <w:lsdException w:name="Note Heading" w:semiHidden="1" w:unhideWhenUsed="1"/>
-    <w:lsdException w:name="Body Text 2" w:semiHidden="1" w:unhideWhenUsed="1"/>
-    <w:lsdException w:name="Body Text 3" w:semiHidden="1" w:unhideWhenUsed="1"/>
-    <w:lsdException w:name="Body Text Indent 2" w:semiHidden="1" w:unhideWhenUsed="1"/>
-    <w:lsdException w:name="Body Text Indent 3" w:semiHidden="1" w:unhideWhenUsed="1"/>
-    <w:lsdException w:name="Block Text" w:semiHidden="1" w:unhideWhenUsed="1"/>
-    <w:lsdException w:name="Hyperlink" w:semiHidden="1" w:unhideWhenUsed="1"/>
-    <w:lsdException w:name="FollowedHyperlink" w:semiHidden="1" w:unhideWhenUsed="1"/>
-    <w:lsdException w:name="Strong" w:uiPriority="22" w:qFormat="1"/>
-    <w:lsdException w:name="Emphasis" w:uiPriority="20" w:qFormat="1"/>
-    <w:lsdException w:name="Document Map" w:semiHidden="1" w:unhideWhenUsed="1"/>
-    <w:lsdException w:name="Plain Text" w:semiHidden="1" w:unhideWhenUsed="1"/>
-    <w:lsdException w:name="E-mail Signature" w:semiHidden="1" w:unhideWhenUsed="1"/>
-    <w:lsdException w:name="HTML Top of Form" w:semiHidden="1" w:unhideWhenUsed="1"/>
-    <w:lsdException w:name="HTML Bottom of Form" w:semiHidden="1" w:unhideWhenUsed="1"/>
-    <w:lsdException w:name="Normal (Web)" w:semiHidden="1" w:unhideWhenUsed="1"/>
-    <w:lsdException w:name="HTML Acronym" w:semiHidden="1" w:unhideWhenUsed="1"/>
-    <w:lsdException w:name="HTML Address" w:semiHidden="1" w:unhideWhenUsed="1"/>
-    <w:lsdException w:name="HTML Cite" w:semiHidden="1" w:unhideWhenUsed="1"/>
-    <w:lsdException w:name="HTML Code" w:semiHidden="1" w:unhideWhenUsed="1"/>
-    <w:lsdException w:name="HTML Definition" w:semiHidden="1" w:unhideWhenUsed="1"/>
-    <w:lsdException w:name="HTML Keyboard" w:semiHidden="1" w:unhideWhenUsed="1"/>
-    <w:lsdException w:name="HTML Preformatted" w:semiHidden="1" w:unhideWhenUsed="1"/>
-    <w:lsdException w:name="HTML Sample" w:semiHidden="1" w:unhideWhenUsed="1"/>
-    <w:lsdException w:name="HTML Typewriter" w:semiHidden="1" w:unhideWhenUsed="1"/>
-    <w:lsdException w:name="HTML Variable" w:semiHidden="1" w:unhideWhenUsed="1"/>
-    <w:lsdException w:name="Normal Table" w:semiHidden="1" w:unhideWhenUsed="1"/>
-    <w:lsdException w:name="annotation subject" w:semiHidden="1" w:unhideWhenUsed="1"/>
-    <w:lsdException w:name="No List" w:semiHidden="1" w:unhideWhenUsed="1"/>
-    <w:lsdException w:name="Outline List 1" w:semiHidden="1" w:unhideWhenUsed="1"/>
-    <w:lsdException w:name="Outline List 2" w:semiHidden="1" w:unhideWhenUsed="1"/>
-    <w:lsdException w:name="Outline List 3" w:semiHidden="1" w:unhideWhenUsed="1"/>
-    <w:lsdException w:name="Table Simple 1" w:semiHidden="1" w:unhideWhenUsed="1"/>
-    <w:lsdException w:name="Table Simple 2" w:semiHidden="1" w:unhideWhenUsed="1"/>
-    <w:lsdException w:name="Table Simple 3" w:semiHidden="1" w:unhideWhenUsed="1"/>
-    <w:lsdException w:name="Table Classic 1" w:semiHidden="1" w:unhideWhenUsed="1"/>
-    <w:lsdException w:name="Table Classic 2" w:semiHidden="1" w:unhideWhenUsed="1"/>
-    <w:lsdException w:name="Table Classic 3" w:semiHidden="1" w:unhideWhenUsed="1"/>
-    <w:lsdException w:name="Table Classic 4" w:semiHidden="1" w:unhideWhenUsed="1"/>
-    <w:lsdException w:name="Table Colorful 1" w:semiHidden="1" w:unhideWhenUsed="1"/>
-    <w:lsdException w:name="Table Colorful 2" w:semiHidden="1" w:unhideWhenUsed="1"/>
-    <w:lsdException w:name="Table Colorful 3" w:semiHidden="1" w:unhideWhenUsed="1"/>
-    <w:lsdException w:name="Table Columns 1" w:semiHidden="1" w:unhideWhenUsed="1"/>
-    <w:lsdException w:name="Table Columns 2" w:semiHidden="1" w:unhideWhenUsed="1"/>
-    <w:lsdException w:name="Table Columns 3" w:semiHidden="1" w:unhideWhenUsed="1"/>
-    <w:lsdException w:name="Table Columns 4" w:semiHidden="1" w:unhideWhenUsed="1"/>
-    <w:lsdException w:name="Table Columns 5" w:semiHidden="1" w:unhideWhenUsed="1"/>
-    <w:lsdException w:name="Table Grid 1" w:semiHidden="1" w:unhideWhenUsed="1"/>
-    <w:lsdException w:name="Table Grid 2" w:semiHidden="1" w:unhideWhenUsed="1"/>
-    <w:lsdException w:name="Table Grid 3" w:semiHidden="1" w:unhideWhenUsed="1"/>
-    <w:lsdException w:name="Table Grid 4" w:semiHidden="1" w:unhideWhenUsed="1"/>
-    <w:lsdException w:name="Table Grid 5" w:semiHidden="1" w:unhideWhenUsed="1"/>
-    <w:lsdException w:name="Table Grid 6" w:semiHidden="1" w:unhideWhenUsed="1"/>
-    <w:lsdException w:name="Table Grid 7" w:semiHidden="1" w:unhideWhenUsed="1"/>
-    <w:lsdException w:name="Table Grid 8" w:semiHidden="1" w:unhideWhenUsed="1"/>
-    <w:lsdException w:name="Table List 1" w:semiHidden="1" w:unhideWhenUsed="1"/>
-    <w:lsdException w:name="Table List 2" w:semiHidden="1" w:unhideWhenUsed="1"/>
-    <w:lsdException w:name="Table List 3" w:semiHidden="1" w:unhideWhenUsed="1"/>
-    <w:lsdException w:name="Table List 4" w:semiHidden="1" w:unhideWhenUsed="1"/>
-    <w:lsdException w:name="Table List 5" w:semiHidden="1" w:unhideWhenUsed="1"/>
-    <w:lsdException w:name="Table List 6" w:semiHidden="1" w:unhideWhenUsed="1"/>
-    <w:lsdException w:name="Table List 7" w:semiHidden="1" w:unhideWhenUsed="1"/>
-    <w:lsdException w:name="Table List 8" w:semiHidden="1" w:unhideWhenUsed="1"/>
-    <w:lsdException w:name="Table 3D effects 1" w:semiHidden="1" w:unhideWhenUsed="1"/>
-    <w:lsdException w:name="Table 3D effects 2" w:semiHidden="1" w:unhideWhenUsed="1"/>
-    <w:lsdException w:name="Table 3D effects 3" w:semiHidden="1" w:unhideWhenUsed="1"/>
-    <w:lsdException w:name="Table Contemporary" w:semiHidden="1" w:unhideWhenUsed="1"/>
-    <w:lsdException w:name="Table Elegant" w:semiHidden="1" w:unhideWhenUsed="1"/>
-    <w:lsdException w:name="Table Professional" w:semiHidden="1" w:unhideWhenUsed="1"/>
-    <w:lsdException w:name="Table Subtle 1" w:semiHidden="1" w:unhideWhenUsed="1"/>
-    <w:lsdException w:name="Table Subtle 2" w:semiHidden="1" w:unhideWhenUsed="1"/>
-    <w:lsdException w:name="Table Web 1" w:semiHidden="1" w:unhideWhenUsed="1"/>
-    <w:lsdException w:name="Table Web 2" w:semiHidden="1" w:unhideWhenUsed="1"/>
-    <w:lsdException w:name="Table Web 3" w:semiHidden="1" w:unhideWhenUsed="1"/>
-    <w:lsdException w:name="Balloon Text" w:semiHidden="1" w:unhideWhenUsed="1"/>
-    <w:lsdException w:name="Table Grid" w:uiPriority="39"/>
-    <w:lsdException w:name="Table Theme" w:semiHidden="1" w:unhideWhenUsed="1"/>
-    <w:lsdException w:name="Placeholder Text" w:semiHidden="1"/>
-    <w:lsdException w:name="No Spacing" w:uiPriority="1" w:qFormat="1"/>
-    <w:lsdException w:name="Light Shading" w:uiPriority="60"/>
-    <w:lsdException w:name="Light List" w:uiPriority="61"/>
-    <w:lsdException w:name="Light Grid" w:uiPriority="62"/>
-    <w:lsdException w:name="Medium Shading 1" w:uiPriority="63"/>
-    <w:lsdException w:name="Medium Shading 2" w:uiPriority="64"/>
-    <w:lsdException w:name="Medium List 1" w:uiPriority="65"/>
-    <w:lsdException w:name="Medium List 2" w:uiPriority="66"/>
-    <w:lsdException w:name="Medium Grid 1" w:uiPriority="67"/>
-    <w:lsdException w:name="Medium Grid 2" w:uiPriority="68"/>
-    <w:lsdException w:name="Medium Grid 3" w:uiPriority="69"/>
-    <w:lsdException w:name="Dark List" w:uiPriority="70"/>
-    <w:lsdException w:name="Colorful Shading" w:uiPriority="71"/>
-    <w:lsdException w:name="Colorful List" w:uiPriority="72"/>
-    <w:lsdException w:name="Colorful Grid" w:uiPriority="73"/>
-    <w:lsdException w:name="Light Shading Accent 1" w:uiPriority="60"/>
-    <w:lsdException w:name="Light List Accent 1" w:uiPriority="61"/>
-    <w:lsdException w:name="Light Grid Accent 1" w:uiPriority="62"/>
-    <w:lsdException w:name="Medium Shading 1 Accent 1" w:uiPriority="63"/>
-    <w:lsdException w:name="Medium Shading 2 Accent 1" w:uiPriority="64"/>
-    <w:lsdException w:name="Medium List 1 Accent 1" w:uiPriority="65"/>
-    <w:lsdException w:name="Revision" w:semiHidden="1"/>
-    <w:lsdException w:name="List Paragraph" w:uiPriority="34" w:qFormat="1"/>
-    <w:lsdException w:name="Quote" w:uiPriority="29" w:qFormat="1"/>
-    <w:lsdException w:name="Intense Quote" w:uiPriority="30" w:qFormat="1"/>
-    <w:lsdException w:name="Medium List 2 Accent 1" w:uiPriority="66"/>
-    <w:lsdException w:name="Medium Grid 1 Accent 1" w:uiPriority="67"/>
-    <w:lsdException w:name="Medium Grid 2 Accent 1" w:uiPriority="68"/>
-    <w:lsdException w:name="Medium Grid 3 Accent 1" w:uiPriority="69"/>
-    <w:lsdException w:name="Dark List Accent 1" w:uiPriority="70"/>
-    <w:lsdException w:name="Colorful Shading Accent 1" w:uiPriority="71"/>
-    <w:lsdException w:name="Colorful List Accent 1" w:uiPriority="72"/>
-    <w:lsdException w:name="Colorful Grid Accent 1" w:uiPriority="73"/>
-    <w:lsdException w:name="Light Shading Accent 2" w:uiPriority="60"/>
-    <w:lsdException w:name="Light List Accent 2" w:uiPriority="61"/>
-    <w:lsdException w:name="Light Grid Accent 2" w:uiPriority="62"/>
-    <w:lsdException w:name="Medium Shading 1 Accent 2" w:uiPriority="63"/>
-    <w:lsdException w:name="Medium Shading 2 Accent 2" w:uiPriority="64"/>
-    <w:lsdException w:name="Medium List 1 Accent 2" w:uiPriority="65"/>
-    <w:lsdException w:name="Medium List 2 Accent 2" w:uiPriority="66"/>
-    <w:lsdException w:name="Medium Grid 1 Accent 2" w:uiPriority="67"/>
-    <w:lsdException w:name="Medium Grid 2 Accent 2" w:uiPriority="68"/>
-    <w:lsdException w:name="Medium Grid 3 Accent 2" w:uiPriority="69"/>
-    <w:lsdException w:name="Dark List Accent 2" w:uiPriority="70"/>
-    <w:lsdException w:name="Colorful Shading Accent 2" w:uiPriority="71"/>
-    <w:lsdException w:name="Colorful List Accent 2" w:uiPriority="72"/>
-    <w:lsdException w:name="Colorful Grid Accent 2" w:uiPriority="73"/>
-    <w:lsdException w:name="Light Shading Accent 3" w:uiPriority="60"/>
-    <w:lsdException w:name="Light List Accent 3" w:uiPriority="61"/>
-    <w:lsdException w:name="Light Grid Accent 3" w:uiPriority="62"/>
-    <w:lsdException w:name="Medium Shading 1 Accent 3" w:uiPriority="63"/>
-    <w:lsdException w:name="Medium Shading 2 Accent 3" w:uiPriority="64"/>
-    <w:lsdException w:name="Medium List 1 Accent 3" w:uiPriority="65"/>
-    <w:lsdException w:name="Medium List 2 Accent 3" w:uiPriority="66"/>
-    <w:lsdException w:name="Medium Grid 1 Accent 3" w:uiPriority="67"/>
-    <w:lsdException w:name="Medium Grid 2 Accent 3" w:uiPriority="68"/>
-    <w:lsdException w:name="Medium Grid 3 Accent 3" w:uiPriority="69"/>
-    <w:lsdException w:name="Dark List Accent 3" w:uiPriority="70"/>
-    <w:lsdException w:name="Colorful Shading Accent 3" w:uiPriority="71"/>
-    <w:lsdException w:name="Colorful List Accent 3" w:uiPriority="72"/>
-    <w:lsdException w:name="Colorful Grid Accent 3" w:uiPriority="73"/>
-    <w:lsdException w:name="Light Shading Accent 4" w:uiPriority="60"/>
-    <w:lsdException w:name="Light List Accent 4" w:uiPriority="61"/>
-    <w:lsdException w:name="Light Grid Accent 4" w:uiPriority="62"/>
-    <w:lsdException w:name="Medium Shading 1 Accent 4" w:uiPriority="63"/>
-    <w:lsdException w:name="Medium Shading 2 Accent 4" w:uiPriority="64"/>
-    <w:lsdException w:name="Medium List 1 Accent 4" w:uiPriority="65"/>
-    <w:lsdException w:name="Medium List 2 Accent 4" w:uiPriority="66"/>
-    <w:lsdException w:name="Medium Grid 1 Accent 4" w:uiPriority="67"/>
-    <w:lsdException w:name="Medium Grid 2 Accent 4" w:uiPriority="68"/>
-    <w:lsdException w:name="Medium Grid 3 Accent 4" w:uiPriority="69"/>
-    <w:lsdException w:name="Dark List Accent 4" w:uiPriority="70"/>
-    <w:lsdException w:name="Colorful Shading Accent 4" w:uiPriority="71"/>
-    <w:lsdException w:name="Colorful List Accent 4" w:uiPriority="72"/>
-    <w:lsdException w:name="Colorful Grid Accent 4" w:uiPriority="73"/>
-    <w:lsdException w:name="Light Shading Accent 5" w:uiPriority="60"/>
-    <w:lsdException w:name="Light List Accent 5" w:uiPriority="61"/>
-    <w:lsdException w:name="Light Grid Accent 5" w:uiPriority="62"/>
-    <w:lsdException w:name="Medium Shading 1 Accent 5" w:uiPriority="63"/>
-    <w:lsdException w:name="Medium Shading 2 Accent 5" w:uiPriority="64"/>
-    <w:lsdException w:name="Medium List 1 Accent 5" w:uiPriority="65"/>
-    <w:lsdException w:name="Medium List 2 Accent 5" w:uiPriority="66"/>
-    <w:lsdException w:name="Medium Grid 1 Accent 5" w:uiPriority="67"/>
-    <w:lsdException w:name="Medium Grid 2 Accent 5" w:uiPriority="68"/>
-    <w:lsdException w:name="Medium Grid 3 Accent 5" w:uiPriority="69"/>
-    <w:lsdException w:name="Dark List Accent 5" w:uiPriority="70"/>
-    <w:lsdException w:name="Colorful Shading Accent 5" w:uiPriority="71"/>
-    <w:lsdException w:name="Colorful List Accent 5" w:uiPriority="72"/>
-    <w:lsdException w:name="Colorful Grid Accent 5" w:uiPriority="73"/>
-    <w:lsdException w:name="Light Shading Accent 6" w:uiPriority="60"/>
-    <w:lsdException w:name="Light List Accent 6" w:uiPriority="61"/>
-    <w:lsdException w:name="Light Grid Accent 6" w:uiPriority="62"/>
-    <w:lsdException w:name="Medium Shading 1 Accent 6" w:uiPriority="63"/>
-    <w:lsdException w:name="Medium Shading 2 Accent 6" w:uiPriority="64"/>
-    <w:lsdException w:name="Medium List 1 Accent 6" w:uiPriority="65"/>
-    <w:lsdException w:name="Medium List 2 Accent 6" w:uiPriority="66"/>
-    <w:lsdException w:name="Medium Grid 1 Accent 6" w:uiPriority="67"/>
-    <w:lsdException w:name="Medium Grid 2 Accent 6" w:uiPriority="68"/>
-    <w:lsdException w:name="Medium Grid 3 Accent 6" w:uiPriority="69"/>
-    <w:lsdException w:name="Dark List Accent 6" w:uiPriority="70"/>
-    <w:lsdException w:name="Colorful Shading Accent 6" w:uiPriority="71"/>
-    <w:lsdException w:name="Colorful List Accent 6" w:uiPriority="72"/>
-    <w:lsdException w:name="Colorful Grid Accent 6" w:uiPriority="73"/>
-    <w:lsdException w:name="Subtle Emphasis" w:uiPriority="19" w:qFormat="1"/>
-    <w:lsdException w:name="Intense Emphasis" w:uiPriority="21" w:qFormat="1"/>
-    <w:lsdException w:name="Subtle Reference" w:uiPriority="31" w:qFormat="1"/>
-    <w:lsdException w:name="Intense Reference" w:uiPriority="32" w:qFormat="1"/>
-    <w:lsdException w:name="Book Title" w:uiPriority="33" w:qFormat="1"/>
-    <w:lsdException w:name="Bibliography" w:semiHidden="1" w:uiPriority="37" w:unhideWhenUsed="1"/>
-    <w:lsdException w:name="TOC Heading" w:semiHidden="1" w:uiPriority="39" w:unhideWhenUsed="1" w:qFormat="1"/>
-    <w:lsdException w:name="Plain Table 1" w:uiPriority="41"/>
-    <w:lsdException w:name="Plain Table 2" w:uiPriority="42"/>
-    <w:lsdException w:name="Plain Table 3" w:uiPriority="43"/>
-    <w:lsdException w:name="Plain Table 4" w:uiPriority="44"/>
-    <w:lsdException w:name="Plain Table 5" w:uiPriority="45"/>
-    <w:lsdException w:name="Grid Table Light" w:uiPriority="40"/>
-    <w:lsdException w:name="Grid Table 1 Light" w:uiPriority="46"/>
-    <w:lsdException w:name="Grid Table 2" w:uiPriority="47"/>
-    <w:lsdException w:name="Grid Table 3" w:uiPriority="48"/>
-    <w:lsdException w:name="Grid Table 4" w:uiPriority="49"/>
-    <w:lsdException w:name="Grid Table 5 Dark" w:uiPriority="50"/>
-    <w:lsdException w:name="Grid Table 6 Colorful" w:uiPriority="51"/>
-    <w:lsdException w:name="Grid Table 7 Colorful" w:uiPriority="52"/>
-    <w:lsdException w:name="Grid Table 1 Light Accent 1" w:uiPriority="46"/>
-    <w:lsdException w:name="Grid Table 2 Accent 1" w:uiPriority="47"/>
-    <w:lsdException w:name="Grid Table 3 Accent 1" w:uiPriority="48"/>
-    <w:lsdException w:name="Grid Table 4 Accent 1" w:uiPriority="49"/>
-    <w:lsdException w:name="Grid Table 5 Dark Accent 1" w:uiPriority="50"/>
-    <w:lsdException w:name="Grid Table 6 Colorful Accent 1" w:uiPriority="51"/>
-    <w:lsdException w:name="Grid Table 7 Colorful Accent 1" w:uiPriority="52"/>
-    <w:lsdException w:name="Grid Table 1 Light Accent 2" w:uiPriority="46"/>
-    <w:lsdException w:name="Grid Table 2 Accent 2" w:uiPriority="47"/>
-    <w:lsdException w:name="Grid Table 3 Accent 2" w:uiPriority="48"/>
-    <w:lsdException w:name="Grid Table 4 Accent 2" w:uiPriority="49"/>
-    <w:lsdException w:name="Grid Table 5 Dark Accent 2" w:uiPriority="50"/>
-    <w:lsdException w:name="Grid Table 6 Colorful Accent 2" w:uiPriority="51"/>
-    <w:lsdException w:name="Grid Table 7 Colorful Accent 2" w:uiPriority="52"/>
-    <w:lsdException w:name="Grid Table 1 Light Accent 3" w:uiPriority="46"/>
-    <w:lsdException w:name="Grid Table 2 Accent 3" w:uiPriority="47"/>
-    <w:lsdException w:name="Grid Table 3 Accent 3" w:uiPriority="48"/>
-    <w:lsdException w:name="Grid Table 4 Accent 3" w:uiPriority="49"/>
-    <w:lsdException w:name="Grid Table 5 Dark Accent 3" w:uiPriority="50"/>
-    <w:lsdException w:name="Grid Table 6 Colorful Accent 3" w:uiPriority="51"/>
-    <w:lsdException w:name="Grid Table 7 Colorful Accent 3" w:uiPriority="52"/>
-    <w:lsdException w:name="Grid Table 1 Light Accent 4" w:uiPriority="46"/>
-    <w:lsdException w:name="Grid Table 2 Accent 4" w:uiPriority="47"/>
-    <w:lsdException w:name="Grid Table 3 Accent 4" w:uiPriority="48"/>
-    <w:lsdException w:name="Grid Table 4 Accent 4" w:uiPriority="49"/>
-    <w:lsdException w:name="Grid Table 5 Dark Accent 4" w:uiPriority="50"/>
-    <w:lsdException w:name="Grid Table 6 Colorful Accent 4" w:uiPriority="51"/>
-    <w:lsdException w:name="Grid Table 7 Colorful Accent 4" w:uiPriority="52"/>
-    <w:lsdException w:name="Grid Table 1 Light Accent 5" w:uiPriority="46"/>
-    <w:lsdException w:name="Grid Table 2 Accent 5" w:uiPriority="47"/>
-    <w:lsdException w:name="Grid Table 3 Accent 5" w:uiPriority="48"/>
-    <w:lsdException w:name="Grid Table 4 Accent 5" w:uiPriority="49"/>
-    <w:lsdException w:name="Grid Table 5 Dark Accent 5" w:uiPriority="50"/>
-    <w:lsdException w:name="Grid Table 6 Colorful Accent 5" w:uiPriority="51"/>
-    <w:lsdException w:name="Grid Table 7 Colorful Accent 5" w:uiPriority="52"/>
-    <w:lsdException w:name="Grid Table 1 Light Accent 6" w:uiPriority="46"/>
-    <w:lsdException w:name="Grid Table 2 Accent 6" w:uiPriority="47"/>
-    <w:lsdException w:name="Grid Table 3 Accent 6" w:uiPriority="48"/>
-    <w:lsdException w:name="Grid Table 4 Accent 6" w:uiPriority="49"/>
-    <w:lsdException w:name="Grid Table 5 Dark Accent 6" w:uiPriority="50"/>
-    <w:lsdException w:name="Grid Table 6 Colorful Accent 6" w:uiPriority="51"/>
-    <w:lsdException w:name="Grid Table 7 Colorful Accent 6" w:uiPriority="52"/>
-    <w:lsdException w:name="List Table 1 Light" w:uiPriority="46"/>
-    <w:lsdException w:name="List Table 2" w:uiPriority="47"/>
-    <w:lsdException w:name="List Table 3" w:uiPriority="48"/>
-    <w:lsdException w:name="List Table 4" w:uiPriority="49"/>
-    <w:lsdException w:name="List Table 5 Dark" w:uiPriority="50"/>
-    <w:lsdException w:name="List Table 6 Colorful" w:uiPriority="51"/>
-    <w:lsdException w:name="List Table 7 Colorful" w:uiPriority="52"/>
-    <w:lsdException w:name="List Table 1 Light Accent 1" w:uiPriority="46"/>
-    <w:lsdException w:name="List Table 2 Accent 1" w:uiPriority="47"/>
-    <w:lsdException w:name="List Table 3 Accent 1" w:uiPriority="48"/>
-    <w:lsdException w:name="List Table 4 Accent 1" w:uiPriority="49"/>
-    <w:lsdException w:name="List Table 5 Dark Accent 1" w:uiPriority="50"/>
-    <w:lsdException w:name="List Table 6 Colorful Accent 1" w:uiPriority="51"/>
-    <w:lsdException w:name="List Table 7 Colorful Accent 1" w:uiPriority="52"/>
-    <w:lsdException w:name="List Table 1 Light Accent 2" w:uiPriority="46"/>
-    <w:lsdException w:name="List Table 2 Accent 2" w:uiPriority="47"/>
-    <w:lsdException w:name="List Table 3 Accent 2" w:uiPriority="48"/>
-    <w:lsdException w:name="List Table 4 Accent 2" w:uiPriority="49"/>
-    <w:lsdException w:name="List Table 5 Dark Accent 2" w:uiPriority="50"/>
-    <w:lsdException w:name="List Table 6 Colorful Accent 2" w:uiPriority="51"/>
-    <w:lsdException w:name="List Table 7 Colorful Accent 2" w:uiPriority="52"/>
-    <w:lsdException w:name="List Table 1 Light Accent 3" w:uiPriority="46"/>
-    <w:lsdException w:name="List Table 2 Accent 3" w:uiPriority="47"/>
-    <w:lsdException w:name="List Table 3 Accent 3" w:uiPriority="48"/>
-    <w:lsdException w:name="List Table 4 Accent 3" w:uiPriority="49"/>
-    <w:lsdException w:name="List Table 5 Dark Accent 3" w:uiPriority="50"/>
-    <w:lsdException w:name="List Table 6 Colorful Accent 3" w:uiPriority="51"/>
-    <w:lsdException w:name="List Table 7 Colorful Accent 3" w:uiPriority="52"/>
-    <w:lsdException w:name="List Table 1 Light Accent 4" w:uiPriority="46"/>
-    <w:lsdException w:name="List Table 2 Accent 4" w:uiPriority="47"/>
-    <w:lsdException w:name="List Table 3 Accent 4" w:uiPriority="48"/>
-    <w:lsdException w:name="List Table 4 Accent 4" w:uiPriority="49"/>
-    <w:lsdException w:name="List Table 5 Dark Accent 4" w:uiPriority="50"/>
-    <w:lsdException w:name="List Table 6 Colorful Accent 4" w:uiPriority="51"/>
-    <w:lsdException w:name="List Table 7 Colorful Accent 4" w:uiPriority="52"/>
-    <w:lsdException w:name="List Table 1 Light Accent 5" w:uiPriority="46"/>
-    <w:lsdException w:name="List Table 2 Accent 5" w:uiPriority="47"/>
-    <w:lsdException w:name="List Table 3 Accent 5" w:uiPriority="48"/>
-    <w:lsdException w:name="List Table 4 Accent 5" w:uiPriority="49"/>
-    <w:lsdException w:name="List Table 5 Dark Accent 5" w:uiPriority="50"/>
-    <w:lsdException w:name="List Table 6 Colorful Accent 5" w:uiPriority="51"/>
-    <w:lsdException w:name="List Table 7 Colorful Accent 5" w:uiPriority="52"/>
-    <w:lsdException w:name="List Table 1 Light Accent 6" w:uiPriority="46"/>
-    <w:lsdException w:name="List Table 2 Accent 6" w:uiPriority="47"/>
-    <w:lsdException w:name="List Table 3 Accent 6" w:uiPriority="48"/>
-    <w:lsdException w:name="List Table 4 Accent 6" w:uiPriority="49"/>
-    <w:lsdException w:name="List Table 5 Dark Accent 6" w:uiPriority="50"/>
-    <w:lsdException w:name="List Table 6 Colorful Accent 6" w:uiPriority="51"/>
-    <w:lsdException w:name="List Table 7 Colorful Accent 6" w:uiPriority="52"/>
-  </w:latentStyles>
-  <w:style w:type="paragraph" w:default="1" w:styleId="Normal">
-    <w:name w:val="Normal"/>
-    <w:qFormat/>
-  </w:style>
-  <w:style w:type="character" w:default="1" w:styleId="Fuentedeprrafopredeter">
-    <w:name w:val="Default Paragraph Font"/>
-    <w:uiPriority w:val="1"/>
-    <w:semiHidden/>
-    <w:unhideWhenUsed/>
-  </w:style>
-  <w:style w:type="table" w:default="1" w:styleId="Tablanormal">
-    <w:name w:val="Normal Table"/>
-    <w:uiPriority w:val="99"/>
-    <w:semiHidden/>
-    <w:unhideWhenUsed/>
-    <w:tblPr>
-      <w:tblInd w:w="0" w:type="dxa"/>
-      <w:tblCellMar>
-        <w:top w:w="0" w:type="dxa"/>
-        <w:left w:w="108" w:type="dxa"/>
-        <w:bottom w:w="0" w:type="dxa"/>
-        <w:right w:w="108" w:type="dxa"/>
-      </w:tblCellMar>
-    </w:tblPr>
-  </w:style>
-  <w:style w:type="numbering" w:default="1" w:styleId="Sinlista">
-    <w:name w:val="No List"/>
-    <w:uiPriority w:val="99"/>
-    <w:semiHidden/>
-    <w:unhideWhenUsed/>
-  </w:style>
-</w:styles>
-</file>
-
-<file path=word/glossary/webSettings.xml><?xml version="1.0" encoding="utf-8"?>
-<w:webSettings xmlns:mc="http://schemas.openxmlformats.org/markup-compatibility/2006" xmlns:r="http://schemas.openxmlformats.org/officeDocument/2006/relationships" xmlns:w="http://schemas.openxmlformats.org/wordprocessingml/2006/main" xmlns:w14="http://schemas.microsoft.com/office/word/2010/wordml" xmlns:w15="http://schemas.microsoft.com/office/word/2012/wordml" xmlns:w16se="http://schemas.microsoft.com/office/word/2015/wordml/symex" mc:Ignorable="w14 w15 w16se"/>
 </file>
 
 <file path=word/theme/theme1.xml><?xml version="1.0" encoding="utf-8"?>
@@ -9000,6 +8493,12 @@
 </file>
 
 <file path=customXml/item1.xml><?xml version="1.0" encoding="utf-8"?>
+<p:properties xmlns:p="http://schemas.microsoft.com/office/2006/metadata/properties" xmlns:xsi="http://www.w3.org/2001/XMLSchema-instance" xmlns:pc="http://schemas.microsoft.com/office/infopath/2007/PartnerControls">
+  <documentManagement/>
+</p:properties>
+</file>
+
+<file path=customXml/item2.xml><?xml version="1.0" encoding="utf-8"?>
 <ct:contentTypeSchema xmlns:ct="http://schemas.microsoft.com/office/2006/metadata/contentType" xmlns:ma="http://schemas.microsoft.com/office/2006/metadata/properties/metaAttributes" ct:_="" ma:_="" ma:contentTypeName="Documento" ma:contentTypeID="0x010100E96778489EE7714D8BD12CC105EB918B" ma:contentTypeVersion="2" ma:contentTypeDescription="Crear nuevo documento." ma:contentTypeScope="" ma:versionID="416c5c7ae9b5d54d83875cd3c65194e3">
   <xsd:schema xmlns:xsd="http://www.w3.org/2001/XMLSchema" xmlns:xs="http://www.w3.org/2001/XMLSchema" xmlns:p="http://schemas.microsoft.com/office/2006/metadata/properties" xmlns:ns2="126e8a1c-9ea9-435a-ac89-d06c80d62e30" targetNamespace="http://schemas.microsoft.com/office/2006/metadata/properties" ma:root="true" ma:fieldsID="70a237c842677bd850644f8595079f5e" ns2:_="">
     <xsd:import namespace="126e8a1c-9ea9-435a-ac89-d06c80d62e30"/>
@@ -9131,13 +8630,11 @@
 </ct:contentTypeSchema>
 </file>
 
-<file path=customXml/item2.xml><?xml version="1.0" encoding="utf-8"?>
-<p:properties xmlns:p="http://schemas.microsoft.com/office/2006/metadata/properties" xmlns:xsi="http://www.w3.org/2001/XMLSchema-instance" xmlns:pc="http://schemas.microsoft.com/office/infopath/2007/PartnerControls">
-  <documentManagement/>
-</p:properties>
+<file path=customXml/item3.xml><?xml version="1.0" encoding="utf-8"?>
+<b:Sources xmlns:b="http://schemas.openxmlformats.org/officeDocument/2006/bibliography" xmlns="http://schemas.openxmlformats.org/officeDocument/2006/bibliography" SelectedStyle="\APASixthEditionOfficeOnline.xsl" StyleName="APA" Version="6"/>
 </file>
 
-<file path=customXml/item3.xml><?xml version="1.0" encoding="utf-8"?>
+<file path=customXml/item4.xml><?xml version="1.0" encoding="utf-8"?>
 <?mso-contentType ?>
 <FormTemplates xmlns="http://schemas.microsoft.com/sharepoint/v3/contenttype/forms">
   <Display>DocumentLibraryForm</Display>
@@ -9146,11 +8643,16 @@
 </FormTemplates>
 </file>
 
-<file path=customXml/item4.xml><?xml version="1.0" encoding="utf-8"?>
-<b:Sources xmlns:b="http://schemas.openxmlformats.org/officeDocument/2006/bibliography" xmlns="http://schemas.openxmlformats.org/officeDocument/2006/bibliography" SelectedStyle="\APASixthEditionOfficeOnline.xsl" StyleName="APA" Version="6"/>
+<file path=customXml/itemProps1.xml><?xml version="1.0" encoding="utf-8"?>
+<ds:datastoreItem xmlns:ds="http://schemas.openxmlformats.org/officeDocument/2006/customXml" ds:itemID="{5F1783E3-BA1C-4CA3-8E32-C9B378BBED03}">
+  <ds:schemaRefs>
+    <ds:schemaRef ds:uri="http://schemas.microsoft.com/office/2006/metadata/properties"/>
+    <ds:schemaRef ds:uri="http://schemas.microsoft.com/office/infopath/2007/PartnerControls"/>
+  </ds:schemaRefs>
+</ds:datastoreItem>
 </file>
 
-<file path=customXml/itemProps1.xml><?xml version="1.0" encoding="utf-8"?>
+<file path=customXml/itemProps2.xml><?xml version="1.0" encoding="utf-8"?>
 <ds:datastoreItem xmlns:ds="http://schemas.openxmlformats.org/officeDocument/2006/customXml" ds:itemID="{DF0582E6-0C2C-40A6-8E3D-E410E41021C1}">
   <ds:schemaRefs>
     <ds:schemaRef ds:uri="http://schemas.microsoft.com/office/2006/metadata/contentType"/>
@@ -9168,34 +8670,18 @@
 </ds:datastoreItem>
 </file>
 
-<file path=customXml/itemProps2.xml><?xml version="1.0" encoding="utf-8"?>
-<ds:datastoreItem xmlns:ds="http://schemas.openxmlformats.org/officeDocument/2006/customXml" ds:itemID="{5F1783E3-BA1C-4CA3-8E32-C9B378BBED03}">
+<file path=customXml/itemProps3.xml><?xml version="1.0" encoding="utf-8"?>
+<ds:datastoreItem xmlns:ds="http://schemas.openxmlformats.org/officeDocument/2006/customXml" ds:itemID="{FBD61725-A60E-40F3-AB5D-0E7F797DD77D}">
   <ds:schemaRefs>
-    <ds:schemaRef ds:uri="http://schemas.openxmlformats.org/package/2006/metadata/core-properties"/>
-    <ds:schemaRef ds:uri="http://schemas.microsoft.com/office/infopath/2007/PartnerControls"/>
-    <ds:schemaRef ds:uri="http://purl.org/dc/elements/1.1/"/>
-    <ds:schemaRef ds:uri="http://schemas.microsoft.com/office/2006/documentManagement/types"/>
-    <ds:schemaRef ds:uri="http://schemas.microsoft.com/office/2006/metadata/properties"/>
-    <ds:schemaRef ds:uri="126e8a1c-9ea9-435a-ac89-d06c80d62e30"/>
-    <ds:schemaRef ds:uri="http://purl.org/dc/terms/"/>
-    <ds:schemaRef ds:uri="http://purl.org/dc/dcmitype/"/>
-    <ds:schemaRef ds:uri="http://www.w3.org/XML/1998/namespace"/>
+    <ds:schemaRef ds:uri="http://schemas.openxmlformats.org/officeDocument/2006/bibliography"/>
   </ds:schemaRefs>
 </ds:datastoreItem>
 </file>
 
-<file path=customXml/itemProps3.xml><?xml version="1.0" encoding="utf-8"?>
+<file path=customXml/itemProps4.xml><?xml version="1.0" encoding="utf-8"?>
 <ds:datastoreItem xmlns:ds="http://schemas.openxmlformats.org/officeDocument/2006/customXml" ds:itemID="{DABAA964-10BA-4DBC-ABF2-CDEAC0FAF7AA}">
   <ds:schemaRefs>
     <ds:schemaRef ds:uri="http://schemas.microsoft.com/sharepoint/v3/contenttype/forms"/>
   </ds:schemaRefs>
 </ds:datastoreItem>
-</file>
-
-<file path=customXml/itemProps4.xml><?xml version="1.0" encoding="utf-8"?>
-<ds:datastoreItem xmlns:ds="http://schemas.openxmlformats.org/officeDocument/2006/customXml" ds:itemID="{FBD61725-A60E-40F3-AB5D-0E7F797DD77D}">
-  <ds:schemaRefs>
-    <ds:schemaRef ds:uri="http://schemas.openxmlformats.org/officeDocument/2006/bibliography"/>
-  </ds:schemaRefs>
-</ds:datastoreItem>
 </file>
</xml_diff>